<commit_message>
Checkpoint: work in progress snapshot
Made-with: Cursor
</commit_message>
<xml_diff>
--- a/creative-engines/docs/Mighty_Ten_Engines_Architecture_Guide_V3.docx
+++ b/creative-engines/docs/Mighty_Ten_Engines_Architecture_Guide_V3.docx
@@ -1,23 +1,23 @@
 
 <file path=word/document.xml><?xml version="1.0" encoding="utf-8"?>
-<w:document xmlns:w="http://schemas.openxmlformats.org/wordprocessingml/2006/main" xmlns:m="http://schemas.openxmlformats.org/officeDocument/2006/math" xmlns:r="http://schemas.openxmlformats.org/officeDocument/2006/relationships" xmlns:o="urn:schemas-microsoft-com:office:office" xmlns:v="urn:schemas-microsoft-com:vml" xmlns:w10="urn:schemas-microsoft-com:office:word" xmlns:a="http://schemas.openxmlformats.org/drawingml/2006/main" xmlns:pic="http://schemas.openxmlformats.org/drawingml/2006/picture" xmlns:wp="http://schemas.openxmlformats.org/drawingml/2006/wordprocessingDrawing">
+<w:document xmlns:wpc="http://schemas.microsoft.com/office/word/2010/wordprocessingCanvas" xmlns:cx="http://schemas.microsoft.com/office/drawing/2014/chartex" xmlns:cx1="http://schemas.microsoft.com/office/drawing/2015/9/8/chartex" xmlns:cx2="http://schemas.microsoft.com/office/drawing/2015/10/21/chartex" xmlns:cx3="http://schemas.microsoft.com/office/drawing/2016/5/9/chartex" xmlns:cx4="http://schemas.microsoft.com/office/drawing/2016/5/10/chartex" xmlns:cx5="http://schemas.microsoft.com/office/drawing/2016/5/11/chartex" xmlns:cx6="http://schemas.microsoft.com/office/drawing/2016/5/12/chartex" xmlns:cx7="http://schemas.microsoft.com/office/drawing/2016/5/13/chartex" xmlns:cx8="http://schemas.microsoft.com/office/drawing/2016/5/14/chartex" xmlns:mc="http://schemas.openxmlformats.org/markup-compatibility/2006" xmlns:aink="http://schemas.microsoft.com/office/drawing/2016/ink" xmlns:am3d="http://schemas.microsoft.com/office/drawing/2017/model3d" xmlns:o="urn:schemas-microsoft-com:office:office" xmlns:oel="http://schemas.microsoft.com/office/2019/extlst" xmlns:r="http://schemas.openxmlformats.org/officeDocument/2006/relationships" xmlns:m="http://schemas.openxmlformats.org/officeDocument/2006/math" xmlns:v="urn:schemas-microsoft-com:vml" xmlns:wp14="http://schemas.microsoft.com/office/word/2010/wordprocessingDrawing" xmlns:wp="http://schemas.openxmlformats.org/drawingml/2006/wordprocessingDrawing" xmlns:w10="urn:schemas-microsoft-com:office:word" xmlns:w="http://schemas.openxmlformats.org/wordprocessingml/2006/main" xmlns:w14="http://schemas.microsoft.com/office/word/2010/wordml" xmlns:w15="http://schemas.microsoft.com/office/word/2012/wordml" xmlns:w16cex="http://schemas.microsoft.com/office/word/2018/wordml/cex" xmlns:w16cid="http://schemas.microsoft.com/office/word/2016/wordml/cid" xmlns:w16="http://schemas.microsoft.com/office/word/2018/wordml" xmlns:w16du="http://schemas.microsoft.com/office/word/2023/wordml/word16du" xmlns:w16sdtdh="http://schemas.microsoft.com/office/word/2020/wordml/sdtdatahash" xmlns:w16sdtfl="http://schemas.microsoft.com/office/word/2024/wordml/sdtformatlock" xmlns:w16se="http://schemas.microsoft.com/office/word/2015/wordml/symex" xmlns:wpg="http://schemas.microsoft.com/office/word/2010/wordprocessingGroup" xmlns:wpi="http://schemas.microsoft.com/office/word/2010/wordprocessingInk" xmlns:wne="http://schemas.microsoft.com/office/word/2006/wordml" xmlns:wps="http://schemas.microsoft.com/office/word/2010/wordprocessingShape" mc:Ignorable="w14 w15 w16se w16cid w16 w16cex w16sdtdh w16sdtfl w16du wp14">
   <w:body>
-    <w:bookmarkStart w:id="24" w:name="mighty-ten-engines-architecture-guide-v3"/>
     <w:p>
       <w:pPr>
         <w:pStyle w:val="Heading1"/>
       </w:pPr>
-      <w:r>
-        <w:t xml:space="preserve">Mighty Ten Engines — Architecture Guide V3</w:t>
-      </w:r>
-    </w:p>
-    <w:bookmarkStart w:id="9" w:name="purpose"/>
+      <w:bookmarkStart w:id="0" w:name="mighty-ten-engines-architecture-guide-v3"/>
+      <w:r>
+        <w:t>Mighty Ten Engines — Architecture Guide V3</w:t>
+      </w:r>
+    </w:p>
     <w:p>
       <w:pPr>
         <w:pStyle w:val="Heading2"/>
       </w:pPr>
-      <w:r>
-        <w:t xml:space="preserve">Purpose</w:t>
+      <w:bookmarkStart w:id="1" w:name="purpose"/>
+      <w:r>
+        <w:t>Purpose</w:t>
       </w:r>
     </w:p>
     <w:p>
@@ -25,40 +25,34 @@
         <w:pStyle w:val="FirstParagraph"/>
       </w:pPr>
       <w:r>
-        <w:t xml:space="preserve">This document describes the</w:t>
-      </w:r>
-      <w:r>
-        <w:t xml:space="preserve"> </w:t>
+        <w:t xml:space="preserve">This document describes the </w:t>
       </w:r>
       <w:r>
         <w:rPr>
           <w:b/>
           <w:bCs/>
         </w:rPr>
-        <w:t xml:space="preserve">architecture</w:t>
-      </w:r>
-      <w:r>
-        <w:t xml:space="preserve"> </w:t>
-      </w:r>
-      <w:r>
-        <w:t xml:space="preserve">of the Mighty Ten global composition framework: system design, component relationships, and how engines integrate with the broader creative-rule-engines ecosystem.</w:t>
-      </w:r>
-    </w:p>
-    <w:p>
-      <w:r>
-        <w:pict>
-          <v:rect style="width:0;height:1.5pt" o:hralign="center" o:hrstd="t" o:hr="t"/>
+        <w:t>architecture</w:t>
+      </w:r>
+      <w:r>
+        <w:t xml:space="preserve"> of the Mighty Ten global composition framework: system design, component relationships, and how engines integrate with the broader creative-rule-engines ecosystem.</w:t>
+      </w:r>
+    </w:p>
+    <w:p>
+      <w:r>
+        <w:pict w14:anchorId="4190F08D">
+          <v:rect id="_x0000_i1025" style="width:0;height:1.5pt" o:hralign="center" o:hrstd="t" o:hr="t"/>
         </w:pict>
       </w:r>
     </w:p>
-    <w:bookmarkEnd w:id="9"/>
-    <w:bookmarkStart w:id="10" w:name="system-architecture-overview"/>
     <w:p>
       <w:pPr>
         <w:pStyle w:val="Heading2"/>
       </w:pPr>
-      <w:r>
-        <w:t xml:space="preserve">System Architecture Overview</w:t>
+      <w:bookmarkStart w:id="2" w:name="system-architecture-overview"/>
+      <w:bookmarkEnd w:id="1"/>
+      <w:r>
+        <w:t>System Architecture Overview</w:t>
       </w:r>
     </w:p>
     <w:p>
@@ -69,7 +63,7 @@
         <w:rPr>
           <w:rStyle w:val="VerbatimChar"/>
         </w:rPr>
-        <w:t xml:space="preserve">creative-rule-engines/</w:t>
+        <w:t>creative-rule-engines/</w:t>
       </w:r>
       <w:r>
         <w:br/>
@@ -78,7 +72,7 @@
         <w:rPr>
           <w:rStyle w:val="VerbatimChar"/>
         </w:rPr>
-        <w:t xml:space="preserve">├── cursor-system-pack.md          ← Master import (single entry point)</w:t>
+        <w:t>├── cursor-system-pack.md          ← Master import (single entry point)</w:t>
       </w:r>
       <w:r>
         <w:br/>
@@ -87,7 +81,7 @@
         <w:rPr>
           <w:rStyle w:val="VerbatimChar"/>
         </w:rPr>
-        <w:t xml:space="preserve">├── creative-engines/              ← Mighty Ten framework</w:t>
+        <w:t>├── creative-engines/              ← Mighty Ten framework</w:t>
       </w:r>
       <w:r>
         <w:br/>
@@ -96,7 +90,7 @@
         <w:rPr>
           <w:rStyle w:val="VerbatimChar"/>
         </w:rPr>
-        <w:t xml:space="preserve">│   ├── engines/                   ← 10 aesthetic engines</w:t>
+        <w:t>│   ├── engines/                   ← 10 aesthetic engines</w:t>
       </w:r>
       <w:r>
         <w:br/>
@@ -105,7 +99,7 @@
         <w:rPr>
           <w:rStyle w:val="VerbatimChar"/>
         </w:rPr>
-        <w:t xml:space="preserve">│   ├── rules/                     ← GCE, anti-monotony, ensemble, engraving, structure</w:t>
+        <w:t>│   ├── rules/                     ← GCE, anti-monotony, ensemble, engraving, structure</w:t>
       </w:r>
       <w:r>
         <w:br/>
@@ -114,7 +108,7 @@
         <w:rPr>
           <w:rStyle w:val="VerbatimChar"/>
         </w:rPr>
-        <w:t xml:space="preserve">│   ├── palettes/                  ← tonality_vault, interval_cycles, triad_pairs, polychords</w:t>
+        <w:t>│   ├── palettes/                  ← tonality_vault, interval_cycles, triad_pairs, polychords</w:t>
       </w:r>
       <w:r>
         <w:br/>
@@ -123,7 +117,7 @@
         <w:rPr>
           <w:rStyle w:val="VerbatimChar"/>
         </w:rPr>
-        <w:t xml:space="preserve">│   ├── templates/                 ← composition_request, revision_loop</w:t>
+        <w:t>│   ├── templates/                 ← composition_request, revision_loop</w:t>
       </w:r>
       <w:r>
         <w:br/>
@@ -132,7 +126,7 @@
         <w:rPr>
           <w:rStyle w:val="VerbatimChar"/>
         </w:rPr>
-        <w:t xml:space="preserve">│   └── docs/                      ← User guides, architecture</w:t>
+        <w:t>│   └── docs/                      ← User guides, architecture</w:t>
       </w:r>
       <w:r>
         <w:br/>
@@ -141,41 +135,41 @@
         <w:rPr>
           <w:rStyle w:val="VerbatimChar"/>
         </w:rPr>
-        <w:t xml:space="preserve">└── music/                         ← Style-specific engines (orchestral, big band, etc.)</w:t>
-      </w:r>
-    </w:p>
-    <w:p>
-      <w:r>
-        <w:pict>
-          <v:rect style="width:0;height:1.5pt" o:hralign="center" o:hrstd="t" o:hr="t"/>
+        <w:t>└── music/                         ← Style-specific engines (orchestral, big band, etc.)</w:t>
+      </w:r>
+    </w:p>
+    <w:p>
+      <w:r>
+        <w:pict w14:anchorId="70693207">
+          <v:rect id="_x0000_i1026" style="width:0;height:1.5pt" o:hralign="center" o:hrstd="t" o:hr="t"/>
         </w:pict>
       </w:r>
     </w:p>
-    <w:bookmarkEnd w:id="10"/>
-    <w:bookmarkStart w:id="16" w:name="component-hierarchy"/>
     <w:p>
       <w:pPr>
         <w:pStyle w:val="Heading2"/>
       </w:pPr>
-      <w:r>
-        <w:t xml:space="preserve">Component Hierarchy</w:t>
-      </w:r>
-    </w:p>
-    <w:bookmarkStart w:id="11" w:name="layer-1-master-system"/>
+      <w:bookmarkStart w:id="3" w:name="component-hierarchy"/>
+      <w:bookmarkEnd w:id="2"/>
+      <w:r>
+        <w:t>Component Hierarchy</w:t>
+      </w:r>
+    </w:p>
     <w:p>
       <w:pPr>
         <w:pStyle w:val="Heading3"/>
       </w:pPr>
-      <w:r>
-        <w:t xml:space="preserve">Layer 1: Master System</w:t>
-      </w:r>
-    </w:p>
-    <w:p>
-      <w:pPr>
-        <w:pStyle w:val="Compact"/>
-        <w:numPr>
-          <w:ilvl w:val="0"/>
-          <w:numId w:val="1001"/>
+      <w:bookmarkStart w:id="4" w:name="layer-1-master-system"/>
+      <w:r>
+        <w:t>Layer 1: Master System</w:t>
+      </w:r>
+    </w:p>
+    <w:p>
+      <w:pPr>
+        <w:pStyle w:val="Compact"/>
+        <w:numPr>
+          <w:ilvl w:val="0"/>
+          <w:numId w:val="2"/>
         </w:numPr>
       </w:pPr>
       <w:r>
@@ -183,43 +177,40 @@
           <w:b/>
           <w:bCs/>
         </w:rPr>
-        <w:t xml:space="preserve">cursor-system-pack.md</w:t>
-      </w:r>
-      <w:r>
-        <w:t xml:space="preserve"> </w:t>
-      </w:r>
-      <w:r>
-        <w:t xml:space="preserve">— Unified system prompt for all Cursor projects</w:t>
-      </w:r>
-    </w:p>
-    <w:p>
-      <w:pPr>
-        <w:pStyle w:val="Compact"/>
-        <w:numPr>
-          <w:ilvl w:val="0"/>
-          <w:numId w:val="1001"/>
-        </w:numPr>
-      </w:pPr>
-      <w:r>
-        <w:t xml:space="preserve">Imports and coordinates: music, literature, therapy-writing, creative-engines</w:t>
-      </w:r>
-    </w:p>
-    <w:bookmarkEnd w:id="11"/>
-    <w:bookmarkStart w:id="12" w:name="layer-2-creative-engines-mighty-ten"/>
+        <w:t>cursor-system-pack.md</w:t>
+      </w:r>
+      <w:r>
+        <w:t xml:space="preserve"> — Unified system prompt for all Cursor projects</w:t>
+      </w:r>
+    </w:p>
+    <w:p>
+      <w:pPr>
+        <w:pStyle w:val="Compact"/>
+        <w:numPr>
+          <w:ilvl w:val="0"/>
+          <w:numId w:val="2"/>
+        </w:numPr>
+      </w:pPr>
+      <w:r>
+        <w:t>Imports and coordinates: music, literature, therapy-writing, creative-engines</w:t>
+      </w:r>
+    </w:p>
     <w:p>
       <w:pPr>
         <w:pStyle w:val="Heading3"/>
       </w:pPr>
-      <w:r>
-        <w:t xml:space="preserve">Layer 2: Creative Engines (Mighty Ten)</w:t>
-      </w:r>
-    </w:p>
-    <w:p>
-      <w:pPr>
-        <w:pStyle w:val="Compact"/>
-        <w:numPr>
-          <w:ilvl w:val="0"/>
-          <w:numId w:val="1002"/>
+      <w:bookmarkStart w:id="5" w:name="layer-2-creative-engines-mighty-ten"/>
+      <w:bookmarkEnd w:id="4"/>
+      <w:r>
+        <w:t>Layer 2: Creative Engines (Mighty Ten)</w:t>
+      </w:r>
+    </w:p>
+    <w:p>
+      <w:pPr>
+        <w:pStyle w:val="Compact"/>
+        <w:numPr>
+          <w:ilvl w:val="0"/>
+          <w:numId w:val="3"/>
         </w:numPr>
       </w:pPr>
       <w:r>
@@ -227,43 +218,40 @@
           <w:b/>
           <w:bCs/>
         </w:rPr>
-        <w:t xml:space="preserve">engines/</w:t>
-      </w:r>
-      <w:r>
-        <w:t xml:space="preserve"> </w:t>
-      </w:r>
-      <w:r>
-        <w:t xml:space="preserve">— 10 aesthetic engines (Scofield, Shorter, Frisell, Wheeler, Stravinsky, Zappa, Slonimsky, Bartók, Counterpoint, Polyphonic)</w:t>
-      </w:r>
-    </w:p>
-    <w:p>
-      <w:pPr>
-        <w:pStyle w:val="Compact"/>
-        <w:numPr>
-          <w:ilvl w:val="0"/>
-          <w:numId w:val="1002"/>
-        </w:numPr>
-      </w:pPr>
-      <w:r>
-        <w:t xml:space="preserve">Each engine defines: core priorities, characteristics, avoid list</w:t>
-      </w:r>
-    </w:p>
-    <w:bookmarkEnd w:id="12"/>
-    <w:bookmarkStart w:id="13" w:name="layer-3-rules"/>
+        <w:t>engines/</w:t>
+      </w:r>
+      <w:r>
+        <w:t xml:space="preserve"> — 10 aesthetic engines (Scofield, Shorter, Frisell, Wheeler, Stravinsky, Zappa, Slonimsky, Bartók, Counterpoint, Polyphonic)</w:t>
+      </w:r>
+    </w:p>
+    <w:p>
+      <w:pPr>
+        <w:pStyle w:val="Compact"/>
+        <w:numPr>
+          <w:ilvl w:val="0"/>
+          <w:numId w:val="3"/>
+        </w:numPr>
+      </w:pPr>
+      <w:r>
+        <w:t>Each engine defines: core priorities, characteristics, avoid list</w:t>
+      </w:r>
+    </w:p>
     <w:p>
       <w:pPr>
         <w:pStyle w:val="Heading3"/>
       </w:pPr>
-      <w:r>
-        <w:t xml:space="preserve">Layer 3: Rules</w:t>
-      </w:r>
-    </w:p>
-    <w:p>
-      <w:pPr>
-        <w:pStyle w:val="Compact"/>
-        <w:numPr>
-          <w:ilvl w:val="0"/>
-          <w:numId w:val="1003"/>
+      <w:bookmarkStart w:id="6" w:name="layer-3-rules"/>
+      <w:bookmarkEnd w:id="5"/>
+      <w:r>
+        <w:t>Layer 3: Rules</w:t>
+      </w:r>
+    </w:p>
+    <w:p>
+      <w:pPr>
+        <w:pStyle w:val="Compact"/>
+        <w:numPr>
+          <w:ilvl w:val="0"/>
+          <w:numId w:val="4"/>
         </w:numPr>
       </w:pPr>
       <w:r>
@@ -271,21 +259,18 @@
           <w:b/>
           <w:bCs/>
         </w:rPr>
-        <w:t xml:space="preserve">gce_evaluation_framework.md</w:t>
-      </w:r>
-      <w:r>
-        <w:t xml:space="preserve"> </w:t>
-      </w:r>
-      <w:r>
-        <w:t xml:space="preserve">— 0–10 scoring, 10 dimensions</w:t>
-      </w:r>
-    </w:p>
-    <w:p>
-      <w:pPr>
-        <w:pStyle w:val="Compact"/>
-        <w:numPr>
-          <w:ilvl w:val="0"/>
-          <w:numId w:val="1003"/>
+        <w:t>gce_evaluation_framework.md</w:t>
+      </w:r>
+      <w:r>
+        <w:t xml:space="preserve"> — 0–10 scoring, 10 dimensions</w:t>
+      </w:r>
+    </w:p>
+    <w:p>
+      <w:pPr>
+        <w:pStyle w:val="Compact"/>
+        <w:numPr>
+          <w:ilvl w:val="0"/>
+          <w:numId w:val="4"/>
         </w:numPr>
       </w:pPr>
       <w:r>
@@ -293,21 +278,18 @@
           <w:b/>
           <w:bCs/>
         </w:rPr>
-        <w:t xml:space="preserve">anti_monotony_rules.md</w:t>
-      </w:r>
-      <w:r>
-        <w:t xml:space="preserve"> </w:t>
-      </w:r>
-      <w:r>
-        <w:t xml:space="preserve">— Motivic variation, harmonic/rhythmic avoidance</w:t>
-      </w:r>
-    </w:p>
-    <w:p>
-      <w:pPr>
-        <w:pStyle w:val="Compact"/>
-        <w:numPr>
-          <w:ilvl w:val="0"/>
-          <w:numId w:val="1003"/>
+        <w:t>anti_monotony_rules.md</w:t>
+      </w:r>
+      <w:r>
+        <w:t xml:space="preserve"> — Motivic variation, harmonic/rhythmic avoidance</w:t>
+      </w:r>
+    </w:p>
+    <w:p>
+      <w:pPr>
+        <w:pStyle w:val="Compact"/>
+        <w:numPr>
+          <w:ilvl w:val="0"/>
+          <w:numId w:val="4"/>
         </w:numPr>
       </w:pPr>
       <w:r>
@@ -315,21 +297,18 @@
           <w:b/>
           <w:bCs/>
         </w:rPr>
-        <w:t xml:space="preserve">ensemble_rules.md</w:t>
-      </w:r>
-      <w:r>
-        <w:t xml:space="preserve"> </w:t>
-      </w:r>
-      <w:r>
-        <w:t xml:space="preserve">— Who has the line, section balance</w:t>
-      </w:r>
-    </w:p>
-    <w:p>
-      <w:pPr>
-        <w:pStyle w:val="Compact"/>
-        <w:numPr>
-          <w:ilvl w:val="0"/>
-          <w:numId w:val="1003"/>
+        <w:t>ensemble_rules.md</w:t>
+      </w:r>
+      <w:r>
+        <w:t xml:space="preserve"> — Who has the line, section balance</w:t>
+      </w:r>
+    </w:p>
+    <w:p>
+      <w:pPr>
+        <w:pStyle w:val="Compact"/>
+        <w:numPr>
+          <w:ilvl w:val="0"/>
+          <w:numId w:val="4"/>
         </w:numPr>
       </w:pPr>
       <w:r>
@@ -337,21 +316,18 @@
           <w:b/>
           <w:bCs/>
         </w:rPr>
-        <w:t xml:space="preserve">engraving_rules.md</w:t>
-      </w:r>
-      <w:r>
-        <w:t xml:space="preserve"> </w:t>
-      </w:r>
-      <w:r>
-        <w:t xml:space="preserve">— Sibelius-friendly MusicXML</w:t>
-      </w:r>
-    </w:p>
-    <w:p>
-      <w:pPr>
-        <w:pStyle w:val="Compact"/>
-        <w:numPr>
-          <w:ilvl w:val="0"/>
-          <w:numId w:val="1003"/>
+        <w:t>engraving_rules.md</w:t>
+      </w:r>
+      <w:r>
+        <w:t xml:space="preserve"> — Sibelius-friendly MusicXML</w:t>
+      </w:r>
+    </w:p>
+    <w:p>
+      <w:pPr>
+        <w:pStyle w:val="Compact"/>
+        <w:numPr>
+          <w:ilvl w:val="0"/>
+          <w:numId w:val="4"/>
         </w:numPr>
       </w:pPr>
       <w:r>
@@ -359,31 +335,29 @@
           <w:b/>
           <w:bCs/>
         </w:rPr>
-        <w:t xml:space="preserve">composition_structure_rules.md</w:t>
-      </w:r>
-      <w:r>
-        <w:t xml:space="preserve"> </w:t>
-      </w:r>
-      <w:r>
-        <w:t xml:space="preserve">— Form, length, motivic development</w:t>
-      </w:r>
-    </w:p>
-    <w:bookmarkEnd w:id="13"/>
-    <w:bookmarkStart w:id="14" w:name="layer-4-palettes"/>
+        <w:t>composition_structure_rules.md</w:t>
+      </w:r>
+      <w:r>
+        <w:t xml:space="preserve"> — Form, length, motivic development</w:t>
+      </w:r>
+    </w:p>
     <w:p>
       <w:pPr>
         <w:pStyle w:val="Heading3"/>
       </w:pPr>
-      <w:r>
-        <w:t xml:space="preserve">Layer 4: Palettes</w:t>
-      </w:r>
-    </w:p>
-    <w:p>
-      <w:pPr>
-        <w:pStyle w:val="Compact"/>
-        <w:numPr>
-          <w:ilvl w:val="0"/>
-          <w:numId w:val="1004"/>
+      <w:bookmarkStart w:id="7" w:name="layer-4-palettes"/>
+      <w:bookmarkEnd w:id="6"/>
+      <w:r>
+        <w:lastRenderedPageBreak/>
+        <w:t>Layer 4: Palettes</w:t>
+      </w:r>
+    </w:p>
+    <w:p>
+      <w:pPr>
+        <w:pStyle w:val="Compact"/>
+        <w:numPr>
+          <w:ilvl w:val="0"/>
+          <w:numId w:val="5"/>
         </w:numPr>
       </w:pPr>
       <w:r>
@@ -391,21 +365,18 @@
           <w:b/>
           <w:bCs/>
         </w:rPr>
-        <w:t xml:space="preserve">tonality_vault.md</w:t>
-      </w:r>
-      <w:r>
-        <w:t xml:space="preserve"> </w:t>
-      </w:r>
-      <w:r>
-        <w:t xml:space="preserve">— Melodic triad, quadratonics, tension layers</w:t>
-      </w:r>
-    </w:p>
-    <w:p>
-      <w:pPr>
-        <w:pStyle w:val="Compact"/>
-        <w:numPr>
-          <w:ilvl w:val="0"/>
-          <w:numId w:val="1004"/>
+        <w:t>tonality_vault.md</w:t>
+      </w:r>
+      <w:r>
+        <w:t xml:space="preserve"> — Melodic triad, quadratonics, tension layers</w:t>
+      </w:r>
+    </w:p>
+    <w:p>
+      <w:pPr>
+        <w:pStyle w:val="Compact"/>
+        <w:numPr>
+          <w:ilvl w:val="0"/>
+          <w:numId w:val="5"/>
         </w:numPr>
       </w:pPr>
       <w:r>
@@ -413,21 +384,18 @@
           <w:b/>
           <w:bCs/>
         </w:rPr>
-        <w:t xml:space="preserve">interval_cycles.md</w:t>
-      </w:r>
-      <w:r>
-        <w:t xml:space="preserve"> </w:t>
-      </w:r>
-      <w:r>
-        <w:t xml:space="preserve">— IC1–IC6, symmetrical structures</w:t>
-      </w:r>
-    </w:p>
-    <w:p>
-      <w:pPr>
-        <w:pStyle w:val="Compact"/>
-        <w:numPr>
-          <w:ilvl w:val="0"/>
-          <w:numId w:val="1004"/>
+        <w:t>interval_cycles.md</w:t>
+      </w:r>
+      <w:r>
+        <w:t xml:space="preserve"> — IC1–IC6, symmetrical structures</w:t>
+      </w:r>
+    </w:p>
+    <w:p>
+      <w:pPr>
+        <w:pStyle w:val="Compact"/>
+        <w:numPr>
+          <w:ilvl w:val="0"/>
+          <w:numId w:val="5"/>
         </w:numPr>
       </w:pPr>
       <w:r>
@@ -435,21 +403,18 @@
           <w:b/>
           <w:bCs/>
         </w:rPr>
-        <w:t xml:space="preserve">triad_pairs.md</w:t>
-      </w:r>
-      <w:r>
-        <w:t xml:space="preserve"> </w:t>
-      </w:r>
-      <w:r>
-        <w:t xml:space="preserve">— Two-triad systems</w:t>
-      </w:r>
-    </w:p>
-    <w:p>
-      <w:pPr>
-        <w:pStyle w:val="Compact"/>
-        <w:numPr>
-          <w:ilvl w:val="0"/>
-          <w:numId w:val="1004"/>
+        <w:t>triad_pairs.md</w:t>
+      </w:r>
+      <w:r>
+        <w:t xml:space="preserve"> — Two-triad systems</w:t>
+      </w:r>
+    </w:p>
+    <w:p>
+      <w:pPr>
+        <w:pStyle w:val="Compact"/>
+        <w:numPr>
+          <w:ilvl w:val="0"/>
+          <w:numId w:val="5"/>
         </w:numPr>
       </w:pPr>
       <w:r>
@@ -457,31 +422,28 @@
           <w:b/>
           <w:bCs/>
         </w:rPr>
-        <w:t xml:space="preserve">polychords.md</w:t>
-      </w:r>
-      <w:r>
-        <w:t xml:space="preserve"> </w:t>
-      </w:r>
-      <w:r>
-        <w:t xml:space="preserve">— Upper/lower structure</w:t>
-      </w:r>
-    </w:p>
-    <w:bookmarkEnd w:id="14"/>
-    <w:bookmarkStart w:id="15" w:name="layer-5-templates"/>
+        <w:t>polychords.md</w:t>
+      </w:r>
+      <w:r>
+        <w:t xml:space="preserve"> — Upper/lower structure</w:t>
+      </w:r>
+    </w:p>
     <w:p>
       <w:pPr>
         <w:pStyle w:val="Heading3"/>
       </w:pPr>
-      <w:r>
-        <w:t xml:space="preserve">Layer 5: Templates</w:t>
-      </w:r>
-    </w:p>
-    <w:p>
-      <w:pPr>
-        <w:pStyle w:val="Compact"/>
-        <w:numPr>
-          <w:ilvl w:val="0"/>
-          <w:numId w:val="1005"/>
+      <w:bookmarkStart w:id="8" w:name="layer-5-templates"/>
+      <w:bookmarkEnd w:id="7"/>
+      <w:r>
+        <w:t>Layer 5: Templates</w:t>
+      </w:r>
+    </w:p>
+    <w:p>
+      <w:pPr>
+        <w:pStyle w:val="Compact"/>
+        <w:numPr>
+          <w:ilvl w:val="0"/>
+          <w:numId w:val="6"/>
         </w:numPr>
       </w:pPr>
       <w:r>
@@ -489,21 +451,18 @@
           <w:b/>
           <w:bCs/>
         </w:rPr>
-        <w:t xml:space="preserve">composition_request_template.md</w:t>
-      </w:r>
-      <w:r>
-        <w:t xml:space="preserve"> </w:t>
-      </w:r>
-      <w:r>
-        <w:t xml:space="preserve">— Request structure</w:t>
-      </w:r>
-    </w:p>
-    <w:p>
-      <w:pPr>
-        <w:pStyle w:val="Compact"/>
-        <w:numPr>
-          <w:ilvl w:val="0"/>
-          <w:numId w:val="1005"/>
+        <w:t>composition_request_template.md</w:t>
+      </w:r>
+      <w:r>
+        <w:t xml:space="preserve"> — Request structure</w:t>
+      </w:r>
+    </w:p>
+    <w:p>
+      <w:pPr>
+        <w:pStyle w:val="Compact"/>
+        <w:numPr>
+          <w:ilvl w:val="0"/>
+          <w:numId w:val="6"/>
         </w:numPr>
       </w:pPr>
       <w:r>
@@ -511,39 +470,36 @@
           <w:b/>
           <w:bCs/>
         </w:rPr>
-        <w:t xml:space="preserve">revision_loop_template.md</w:t>
-      </w:r>
-      <w:r>
-        <w:t xml:space="preserve"> </w:t>
-      </w:r>
-      <w:r>
-        <w:t xml:space="preserve">— Iteration structure</w:t>
-      </w:r>
-    </w:p>
-    <w:p>
-      <w:r>
-        <w:pict>
-          <v:rect style="width:0;height:1.5pt" o:hralign="center" o:hrstd="t" o:hr="t"/>
+        <w:t>revision_loop_template.md</w:t>
+      </w:r>
+      <w:r>
+        <w:t xml:space="preserve"> — Iteration structure</w:t>
+      </w:r>
+    </w:p>
+    <w:p>
+      <w:r>
+        <w:pict w14:anchorId="0EB12A76">
+          <v:rect id="_x0000_i1027" style="width:0;height:1.5pt" o:hralign="center" o:hrstd="t" o:hr="t"/>
         </w:pict>
       </w:r>
     </w:p>
-    <w:bookmarkEnd w:id="15"/>
-    <w:bookmarkEnd w:id="16"/>
-    <w:bookmarkStart w:id="17" w:name="engine-design-principles"/>
     <w:p>
       <w:pPr>
         <w:pStyle w:val="Heading2"/>
       </w:pPr>
-      <w:r>
-        <w:t xml:space="preserve">Engine Design Principles</w:t>
-      </w:r>
-    </w:p>
-    <w:p>
-      <w:pPr>
-        <w:pStyle w:val="Compact"/>
-        <w:numPr>
-          <w:ilvl w:val="0"/>
-          <w:numId w:val="1006"/>
+      <w:bookmarkStart w:id="9" w:name="engine-design-principles"/>
+      <w:bookmarkEnd w:id="3"/>
+      <w:bookmarkEnd w:id="8"/>
+      <w:r>
+        <w:t>Engine Design Principles</w:t>
+      </w:r>
+    </w:p>
+    <w:p>
+      <w:pPr>
+        <w:pStyle w:val="Compact"/>
+        <w:numPr>
+          <w:ilvl w:val="0"/>
+          <w:numId w:val="7"/>
         </w:numPr>
       </w:pPr>
       <w:r>
@@ -551,21 +507,18 @@
           <w:b/>
           <w:bCs/>
         </w:rPr>
-        <w:t xml:space="preserve">One primary aesthetic per engine</w:t>
-      </w:r>
-      <w:r>
-        <w:t xml:space="preserve"> </w:t>
-      </w:r>
-      <w:r>
-        <w:t xml:space="preserve">— Each engine has a clear identity</w:t>
-      </w:r>
-    </w:p>
-    <w:p>
-      <w:pPr>
-        <w:pStyle w:val="Compact"/>
-        <w:numPr>
-          <w:ilvl w:val="0"/>
-          <w:numId w:val="1006"/>
+        <w:t>One primary aesthetic per engine</w:t>
+      </w:r>
+      <w:r>
+        <w:t xml:space="preserve"> — Each engine has a clear identity</w:t>
+      </w:r>
+    </w:p>
+    <w:p>
+      <w:pPr>
+        <w:pStyle w:val="Compact"/>
+        <w:numPr>
+          <w:ilvl w:val="0"/>
+          <w:numId w:val="7"/>
         </w:numPr>
       </w:pPr>
       <w:r>
@@ -573,21 +526,18 @@
           <w:b/>
           <w:bCs/>
         </w:rPr>
-        <w:t xml:space="preserve">Composability</w:t>
-      </w:r>
-      <w:r>
-        <w:t xml:space="preserve"> </w:t>
-      </w:r>
-      <w:r>
-        <w:t xml:space="preserve">— Engines can combine (hybrid) or rotate (album)</w:t>
-      </w:r>
-    </w:p>
-    <w:p>
-      <w:pPr>
-        <w:pStyle w:val="Compact"/>
-        <w:numPr>
-          <w:ilvl w:val="0"/>
-          <w:numId w:val="1006"/>
+        <w:t>Composability</w:t>
+      </w:r>
+      <w:r>
+        <w:t xml:space="preserve"> — Engines can combine (hybrid) or rotate (album)</w:t>
+      </w:r>
+    </w:p>
+    <w:p>
+      <w:pPr>
+        <w:pStyle w:val="Compact"/>
+        <w:numPr>
+          <w:ilvl w:val="0"/>
+          <w:numId w:val="7"/>
         </w:numPr>
       </w:pPr>
       <w:r>
@@ -595,21 +545,18 @@
           <w:b/>
           <w:bCs/>
         </w:rPr>
-        <w:t xml:space="preserve">GCE gate</w:t>
-      </w:r>
-      <w:r>
-        <w:t xml:space="preserve"> </w:t>
-      </w:r>
-      <w:r>
-        <w:t xml:space="preserve">— No MusicXML output until GCE ≥ 9</w:t>
-      </w:r>
-    </w:p>
-    <w:p>
-      <w:pPr>
-        <w:pStyle w:val="Compact"/>
-        <w:numPr>
-          <w:ilvl w:val="0"/>
-          <w:numId w:val="1006"/>
+        <w:t>GCE gate</w:t>
+      </w:r>
+      <w:r>
+        <w:t xml:space="preserve"> — No MusicXML output until GCE ≥ 9</w:t>
+      </w:r>
+    </w:p>
+    <w:p>
+      <w:pPr>
+        <w:pStyle w:val="Compact"/>
+        <w:numPr>
+          <w:ilvl w:val="0"/>
+          <w:numId w:val="7"/>
         </w:numPr>
       </w:pPr>
       <w:r>
@@ -617,21 +564,18 @@
           <w:b/>
           <w:bCs/>
         </w:rPr>
-        <w:t xml:space="preserve">Tonality Vault integration</w:t>
-      </w:r>
-      <w:r>
-        <w:t xml:space="preserve"> </w:t>
-      </w:r>
-      <w:r>
-        <w:t xml:space="preserve">— All engines use the shared harmonic framework</w:t>
-      </w:r>
-    </w:p>
-    <w:p>
-      <w:pPr>
-        <w:pStyle w:val="Compact"/>
-        <w:numPr>
-          <w:ilvl w:val="0"/>
-          <w:numId w:val="1006"/>
+        <w:t>Tonality Vault integration</w:t>
+      </w:r>
+      <w:r>
+        <w:t xml:space="preserve"> — All engines use the shared harmonic framework</w:t>
+      </w:r>
+    </w:p>
+    <w:p>
+      <w:pPr>
+        <w:pStyle w:val="Compact"/>
+        <w:numPr>
+          <w:ilvl w:val="0"/>
+          <w:numId w:val="7"/>
         </w:numPr>
       </w:pPr>
       <w:r>
@@ -639,85 +583,91 @@
           <w:b/>
           <w:bCs/>
         </w:rPr>
-        <w:t xml:space="preserve">Canonical home</w:t>
-      </w:r>
-      <w:r>
-        <w:t xml:space="preserve"> </w:t>
-      </w:r>
-      <w:r>
-        <w:t xml:space="preserve">— This repo is the single source of truth; no local redefinition</w:t>
-      </w:r>
-    </w:p>
-    <w:p>
-      <w:r>
-        <w:pict>
-          <v:rect style="width:0;height:1.5pt" o:hralign="center" o:hrstd="t" o:hr="t"/>
+        <w:t>Canonical home</w:t>
+      </w:r>
+      <w:r>
+        <w:t xml:space="preserve"> — This repo is the single source of truth; no local redefinition</w:t>
+      </w:r>
+    </w:p>
+    <w:p>
+      <w:r>
+        <w:pict w14:anchorId="3DB6A458">
+          <v:rect id="_x0000_i1028" style="width:0;height:1.5pt" o:hralign="center" o:hrstd="t" o:hr="t"/>
         </w:pict>
       </w:r>
     </w:p>
-    <w:bookmarkEnd w:id="17"/>
-    <w:bookmarkStart w:id="18" w:name="engine-categories-architectural"/>
     <w:p>
       <w:pPr>
         <w:pStyle w:val="Heading2"/>
       </w:pPr>
-      <w:r>
-        <w:t xml:space="preserve">Engine Categories (Architectural)</w:t>
+      <w:bookmarkStart w:id="10" w:name="engine-categories-architectural"/>
+      <w:bookmarkEnd w:id="9"/>
+      <w:r>
+        <w:t>Engine Categories (Architectural)</w:t>
       </w:r>
     </w:p>
     <w:tbl>
       <w:tblPr>
         <w:tblStyle w:val="Table"/>
-        <w:tblW w:type="pct" w:w="5000"/>
+        <w:tblW w:w="5000" w:type="pct"/>
         <w:tblLayout w:type="fixed"/>
-        <w:tblLook w:firstRow="1" w:lastRow="0" w:firstColumn="0" w:lastColumn="0" w:noHBand="0" w:noVBand="0" w:val="0020"/>
+        <w:tblLook w:val="0020" w:firstRow="1" w:lastRow="0" w:firstColumn="0" w:lastColumn="0" w:noHBand="0" w:noVBand="0"/>
       </w:tblPr>
       <w:tblGrid>
-        <w:gridCol w:w="2329"/>
-        <w:gridCol w:w="2096"/>
-        <w:gridCol w:w="3494"/>
+        <w:gridCol w:w="2816"/>
+        <w:gridCol w:w="2535"/>
+        <w:gridCol w:w="4225"/>
       </w:tblGrid>
       <w:tr>
         <w:trPr>
-          <w:tblHeader w:val="on"/>
+          <w:cnfStyle w:val="100000000000" w:firstRow="1" w:lastRow="0" w:firstColumn="0" w:lastColumn="0" w:oddVBand="0" w:evenVBand="0" w:oddHBand="0" w:evenHBand="0" w:firstRowFirstColumn="0" w:firstRowLastColumn="0" w:lastRowFirstColumn="0" w:lastRowLastColumn="0"/>
+          <w:tblHeader/>
         </w:trPr>
         <w:tc>
-          <w:tcPr/>
+          <w:tcPr>
+            <w:tcW w:w="2329" w:type="dxa"/>
+          </w:tcPr>
           <w:p>
             <w:pPr>
               <w:pStyle w:val="Compact"/>
             </w:pPr>
             <w:r>
-              <w:t xml:space="preserve">Category</w:t>
+              <w:t>Category</w:t>
             </w:r>
           </w:p>
         </w:tc>
         <w:tc>
-          <w:tcPr/>
+          <w:tcPr>
+            <w:tcW w:w="2096" w:type="dxa"/>
+          </w:tcPr>
           <w:p>
             <w:pPr>
               <w:pStyle w:val="Compact"/>
             </w:pPr>
             <w:r>
-              <w:t xml:space="preserve">Engines</w:t>
+              <w:t>Engines</w:t>
             </w:r>
           </w:p>
         </w:tc>
         <w:tc>
-          <w:tcPr/>
+          <w:tcPr>
+            <w:tcW w:w="3494" w:type="dxa"/>
+          </w:tcPr>
           <w:p>
             <w:pPr>
               <w:pStyle w:val="Compact"/>
             </w:pPr>
             <w:r>
-              <w:t xml:space="preserve">Shared Traits</w:t>
+              <w:t>Shared Traits</w:t>
             </w:r>
           </w:p>
         </w:tc>
       </w:tr>
       <w:tr>
         <w:tc>
-          <w:tcPr/>
+          <w:tcPr>
+            <w:tcW w:w="2329" w:type="dxa"/>
+          </w:tcPr>
           <w:p>
             <w:pPr>
               <w:pStyle w:val="Compact"/>
@@ -727,36 +677,42 @@
                 <w:b/>
                 <w:bCs/>
               </w:rPr>
-              <w:t xml:space="preserve">Groove</w:t>
+              <w:t>Groove</w:t>
             </w:r>
           </w:p>
         </w:tc>
         <w:tc>
-          <w:tcPr/>
+          <w:tcPr>
+            <w:tcW w:w="2096" w:type="dxa"/>
+          </w:tcPr>
           <w:p>
             <w:pPr>
               <w:pStyle w:val="Compact"/>
             </w:pPr>
             <w:r>
-              <w:t xml:space="preserve">Scofield–Holland</w:t>
+              <w:t>Scofield–Holland</w:t>
             </w:r>
           </w:p>
         </w:tc>
         <w:tc>
-          <w:tcPr/>
+          <w:tcPr>
+            <w:tcW w:w="3494" w:type="dxa"/>
+          </w:tcPr>
           <w:p>
             <w:pPr>
               <w:pStyle w:val="Compact"/>
             </w:pPr>
             <w:r>
-              <w:t xml:space="preserve">Rhythm-section, forward motion</w:t>
+              <w:t>Rhythm-section, forward motion</w:t>
             </w:r>
           </w:p>
         </w:tc>
       </w:tr>
       <w:tr>
         <w:tc>
-          <w:tcPr/>
+          <w:tcPr>
+            <w:tcW w:w="2329" w:type="dxa"/>
+          </w:tcPr>
           <w:p>
             <w:pPr>
               <w:pStyle w:val="Compact"/>
@@ -766,36 +722,42 @@
                 <w:b/>
                 <w:bCs/>
               </w:rPr>
-              <w:t xml:space="preserve">Narrative</w:t>
+              <w:t>Narrative</w:t>
             </w:r>
           </w:p>
         </w:tc>
         <w:tc>
-          <w:tcPr/>
+          <w:tcPr>
+            <w:tcW w:w="2096" w:type="dxa"/>
+          </w:tcPr>
           <w:p>
             <w:pPr>
               <w:pStyle w:val="Compact"/>
             </w:pPr>
             <w:r>
-              <w:t xml:space="preserve">Shorter, Counterpoint</w:t>
+              <w:t>Shorter, Counterpoint</w:t>
             </w:r>
           </w:p>
         </w:tc>
         <w:tc>
-          <w:tcPr/>
+          <w:tcPr>
+            <w:tcW w:w="3494" w:type="dxa"/>
+          </w:tcPr>
           <w:p>
             <w:pPr>
               <w:pStyle w:val="Compact"/>
             </w:pPr>
             <w:r>
-              <w:t xml:space="preserve">Motivic logic, sectional structure</w:t>
+              <w:t>Motivic logic, sectional structure</w:t>
             </w:r>
           </w:p>
         </w:tc>
       </w:tr>
       <w:tr>
         <w:tc>
-          <w:tcPr/>
+          <w:tcPr>
+            <w:tcW w:w="2329" w:type="dxa"/>
+          </w:tcPr>
           <w:p>
             <w:pPr>
               <w:pStyle w:val="Compact"/>
@@ -805,36 +767,42 @@
                 <w:b/>
                 <w:bCs/>
               </w:rPr>
-              <w:t xml:space="preserve">Atmospheric</w:t>
+              <w:t>Atmospheric</w:t>
             </w:r>
           </w:p>
         </w:tc>
         <w:tc>
-          <w:tcPr/>
+          <w:tcPr>
+            <w:tcW w:w="2096" w:type="dxa"/>
+          </w:tcPr>
           <w:p>
             <w:pPr>
               <w:pStyle w:val="Compact"/>
             </w:pPr>
             <w:r>
-              <w:t xml:space="preserve">Frisell, Bartók</w:t>
+              <w:t>Frisell, Bartók</w:t>
             </w:r>
           </w:p>
         </w:tc>
         <w:tc>
-          <w:tcPr/>
+          <w:tcPr>
+            <w:tcW w:w="3494" w:type="dxa"/>
+          </w:tcPr>
           <w:p>
             <w:pPr>
               <w:pStyle w:val="Compact"/>
             </w:pPr>
             <w:r>
-              <w:t xml:space="preserve">Space, colour, restraint or darkness</w:t>
+              <w:t>Space, colour, restraint or darkness</w:t>
             </w:r>
           </w:p>
         </w:tc>
       </w:tr>
       <w:tr>
         <w:tc>
-          <w:tcPr/>
+          <w:tcPr>
+            <w:tcW w:w="2329" w:type="dxa"/>
+          </w:tcPr>
           <w:p>
             <w:pPr>
               <w:pStyle w:val="Compact"/>
@@ -844,36 +812,42 @@
                 <w:b/>
                 <w:bCs/>
               </w:rPr>
-              <w:t xml:space="preserve">Lyrical</w:t>
+              <w:t>Lyrical</w:t>
             </w:r>
           </w:p>
         </w:tc>
         <w:tc>
-          <w:tcPr/>
+          <w:tcPr>
+            <w:tcW w:w="2096" w:type="dxa"/>
+          </w:tcPr>
           <w:p>
             <w:pPr>
               <w:pStyle w:val="Compact"/>
             </w:pPr>
             <w:r>
-              <w:t xml:space="preserve">Wheeler</w:t>
+              <w:t>Wheeler</w:t>
             </w:r>
           </w:p>
         </w:tc>
         <w:tc>
-          <w:tcPr/>
+          <w:tcPr>
+            <w:tcW w:w="3494" w:type="dxa"/>
+          </w:tcPr>
           <w:p>
             <w:pPr>
               <w:pStyle w:val="Compact"/>
             </w:pPr>
             <w:r>
-              <w:t xml:space="preserve">Melody, warmth, singability</w:t>
+              <w:t>Melody, warmth, singability</w:t>
             </w:r>
           </w:p>
         </w:tc>
       </w:tr>
       <w:tr>
         <w:tc>
-          <w:tcPr/>
+          <w:tcPr>
+            <w:tcW w:w="2329" w:type="dxa"/>
+          </w:tcPr>
           <w:p>
             <w:pPr>
               <w:pStyle w:val="Compact"/>
@@ -883,36 +857,42 @@
                 <w:b/>
                 <w:bCs/>
               </w:rPr>
-              <w:t xml:space="preserve">Rhythmic</w:t>
+              <w:t>Rhythmic</w:t>
             </w:r>
           </w:p>
         </w:tc>
         <w:tc>
-          <w:tcPr/>
+          <w:tcPr>
+            <w:tcW w:w="2096" w:type="dxa"/>
+          </w:tcPr>
           <w:p>
             <w:pPr>
               <w:pStyle w:val="Compact"/>
             </w:pPr>
             <w:r>
-              <w:t xml:space="preserve">Stravinsky, Zappa</w:t>
+              <w:t>Stravinsky, Zappa</w:t>
             </w:r>
           </w:p>
         </w:tc>
         <w:tc>
-          <w:tcPr/>
+          <w:tcPr>
+            <w:tcW w:w="3494" w:type="dxa"/>
+          </w:tcPr>
           <w:p>
             <w:pPr>
               <w:pStyle w:val="Compact"/>
             </w:pPr>
             <w:r>
-              <w:t xml:space="preserve">Pulse, disruption, metric play</w:t>
+              <w:t>Pulse, disruption, metric play</w:t>
             </w:r>
           </w:p>
         </w:tc>
       </w:tr>
       <w:tr>
         <w:tc>
-          <w:tcPr/>
+          <w:tcPr>
+            <w:tcW w:w="2329" w:type="dxa"/>
+          </w:tcPr>
           <w:p>
             <w:pPr>
               <w:pStyle w:val="Compact"/>
@@ -922,36 +902,42 @@
                 <w:b/>
                 <w:bCs/>
               </w:rPr>
-              <w:t xml:space="preserve">Harmonic</w:t>
+              <w:t>Harmonic</w:t>
             </w:r>
           </w:p>
         </w:tc>
         <w:tc>
-          <w:tcPr/>
+          <w:tcPr>
+            <w:tcW w:w="2096" w:type="dxa"/>
+          </w:tcPr>
           <w:p>
             <w:pPr>
               <w:pStyle w:val="Compact"/>
             </w:pPr>
             <w:r>
-              <w:t xml:space="preserve">Slonimsky</w:t>
+              <w:t>Slonimsky</w:t>
             </w:r>
           </w:p>
         </w:tc>
         <w:tc>
-          <w:tcPr/>
+          <w:tcPr>
+            <w:tcW w:w="3494" w:type="dxa"/>
+          </w:tcPr>
           <w:p>
             <w:pPr>
               <w:pStyle w:val="Compact"/>
             </w:pPr>
             <w:r>
-              <w:t xml:space="preserve">Systematic, non-functional</w:t>
+              <w:t>Systematic, non-functional</w:t>
             </w:r>
           </w:p>
         </w:tc>
       </w:tr>
       <w:tr>
         <w:tc>
-          <w:tcPr/>
+          <w:tcPr>
+            <w:tcW w:w="2329" w:type="dxa"/>
+          </w:tcPr>
           <w:p>
             <w:pPr>
               <w:pStyle w:val="Compact"/>
@@ -961,29 +947,33 @@
                 <w:b/>
                 <w:bCs/>
               </w:rPr>
-              <w:t xml:space="preserve">Polyphonic</w:t>
+              <w:t>Polyphonic</w:t>
             </w:r>
           </w:p>
         </w:tc>
         <w:tc>
-          <w:tcPr/>
+          <w:tcPr>
+            <w:tcW w:w="2096" w:type="dxa"/>
+          </w:tcPr>
           <w:p>
             <w:pPr>
               <w:pStyle w:val="Compact"/>
             </w:pPr>
             <w:r>
-              <w:t xml:space="preserve">Counterpoint, Polyphonic Labyrinth</w:t>
+              <w:t>Counterpoint, Polyphonic Labyrinth</w:t>
             </w:r>
           </w:p>
         </w:tc>
         <w:tc>
-          <w:tcPr/>
+          <w:tcPr>
+            <w:tcW w:w="3494" w:type="dxa"/>
+          </w:tcPr>
           <w:p>
             <w:pPr>
               <w:pStyle w:val="Compact"/>
             </w:pPr>
             <w:r>
-              <w:t xml:space="preserve">Multi-voice, independence</w:t>
+              <w:t>Multi-voice, independence</w:t>
             </w:r>
           </w:p>
         </w:tc>
@@ -991,27 +981,27 @@
     </w:tbl>
     <w:p>
       <w:r>
-        <w:pict>
-          <v:rect style="width:0;height:1.5pt" o:hralign="center" o:hrstd="t" o:hr="t"/>
+        <w:pict w14:anchorId="22CB95A5">
+          <v:rect id="_x0000_i1029" style="width:0;height:1.5pt" o:hralign="center" o:hrstd="t" o:hr="t"/>
         </w:pict>
       </w:r>
     </w:p>
-    <w:bookmarkEnd w:id="18"/>
-    <w:bookmarkStart w:id="19" w:name="data-flow"/>
     <w:p>
       <w:pPr>
         <w:pStyle w:val="Heading2"/>
       </w:pPr>
-      <w:r>
-        <w:t xml:space="preserve">Data Flow</w:t>
-      </w:r>
-    </w:p>
-    <w:p>
-      <w:pPr>
-        <w:pStyle w:val="Compact"/>
-        <w:numPr>
-          <w:ilvl w:val="0"/>
-          <w:numId w:val="1007"/>
+      <w:bookmarkStart w:id="11" w:name="data-flow"/>
+      <w:bookmarkEnd w:id="10"/>
+      <w:r>
+        <w:t>Data Flow</w:t>
+      </w:r>
+    </w:p>
+    <w:p>
+      <w:pPr>
+        <w:pStyle w:val="Compact"/>
+        <w:numPr>
+          <w:ilvl w:val="0"/>
+          <w:numId w:val="8"/>
         </w:numPr>
       </w:pPr>
       <w:r>
@@ -1019,21 +1009,18 @@
           <w:b/>
           <w:bCs/>
         </w:rPr>
-        <w:t xml:space="preserve">Selection</w:t>
-      </w:r>
-      <w:r>
-        <w:t xml:space="preserve"> </w:t>
-      </w:r>
-      <w:r>
-        <w:t xml:space="preserve">— User or AI selects engine(s) from palette</w:t>
-      </w:r>
-    </w:p>
-    <w:p>
-      <w:pPr>
-        <w:pStyle w:val="Compact"/>
-        <w:numPr>
-          <w:ilvl w:val="0"/>
-          <w:numId w:val="1007"/>
+        <w:t>Selection</w:t>
+      </w:r>
+      <w:r>
+        <w:t xml:space="preserve"> — User or AI selects engine(s) from palette</w:t>
+      </w:r>
+    </w:p>
+    <w:p>
+      <w:pPr>
+        <w:pStyle w:val="Compact"/>
+        <w:numPr>
+          <w:ilvl w:val="0"/>
+          <w:numId w:val="8"/>
         </w:numPr>
       </w:pPr>
       <w:r>
@@ -1041,21 +1028,18 @@
           <w:b/>
           <w:bCs/>
         </w:rPr>
-        <w:t xml:space="preserve">Request</w:t>
-      </w:r>
-      <w:r>
-        <w:t xml:space="preserve"> </w:t>
-      </w:r>
-      <w:r>
-        <w:t xml:space="preserve">— Composition request template filled</w:t>
-      </w:r>
-    </w:p>
-    <w:p>
-      <w:pPr>
-        <w:pStyle w:val="Compact"/>
-        <w:numPr>
-          <w:ilvl w:val="0"/>
-          <w:numId w:val="1007"/>
+        <w:t>Request</w:t>
+      </w:r>
+      <w:r>
+        <w:t xml:space="preserve"> — Composition request template filled</w:t>
+      </w:r>
+    </w:p>
+    <w:p>
+      <w:pPr>
+        <w:pStyle w:val="Compact"/>
+        <w:numPr>
+          <w:ilvl w:val="0"/>
+          <w:numId w:val="8"/>
         </w:numPr>
       </w:pPr>
       <w:r>
@@ -1063,21 +1047,18 @@
           <w:b/>
           <w:bCs/>
         </w:rPr>
-        <w:t xml:space="preserve">Composition</w:t>
-      </w:r>
-      <w:r>
-        <w:t xml:space="preserve"> </w:t>
-      </w:r>
-      <w:r>
-        <w:t xml:space="preserve">— AI composes using engine + rules + palettes</w:t>
-      </w:r>
-    </w:p>
-    <w:p>
-      <w:pPr>
-        <w:pStyle w:val="Compact"/>
-        <w:numPr>
-          <w:ilvl w:val="0"/>
-          <w:numId w:val="1007"/>
+        <w:t>Composition</w:t>
+      </w:r>
+      <w:r>
+        <w:t xml:space="preserve"> — AI composes using engine + rules + palettes</w:t>
+      </w:r>
+    </w:p>
+    <w:p>
+      <w:pPr>
+        <w:pStyle w:val="Compact"/>
+        <w:numPr>
+          <w:ilvl w:val="0"/>
+          <w:numId w:val="8"/>
         </w:numPr>
       </w:pPr>
       <w:r>
@@ -1085,21 +1066,18 @@
           <w:b/>
           <w:bCs/>
         </w:rPr>
-        <w:t xml:space="preserve">GCE Check</w:t>
-      </w:r>
-      <w:r>
-        <w:t xml:space="preserve"> </w:t>
-      </w:r>
-      <w:r>
-        <w:t xml:space="preserve">— Score on 10 dimensions; if &lt; 7 on any axis, revise</w:t>
-      </w:r>
-    </w:p>
-    <w:p>
-      <w:pPr>
-        <w:pStyle w:val="Compact"/>
-        <w:numPr>
-          <w:ilvl w:val="0"/>
-          <w:numId w:val="1007"/>
+        <w:t>GCE Check</w:t>
+      </w:r>
+      <w:r>
+        <w:t xml:space="preserve"> — Score on 10 dimensions; if &lt; 7 on any axis, revise</w:t>
+      </w:r>
+    </w:p>
+    <w:p>
+      <w:pPr>
+        <w:pStyle w:val="Compact"/>
+        <w:numPr>
+          <w:ilvl w:val="0"/>
+          <w:numId w:val="8"/>
         </w:numPr>
       </w:pPr>
       <w:r>
@@ -1107,21 +1085,18 @@
           <w:b/>
           <w:bCs/>
         </w:rPr>
-        <w:t xml:space="preserve">Iteration</w:t>
-      </w:r>
-      <w:r>
-        <w:t xml:space="preserve"> </w:t>
-      </w:r>
-      <w:r>
-        <w:t xml:space="preserve">— Revision loop until GCE ≥ 9</w:t>
-      </w:r>
-    </w:p>
-    <w:p>
-      <w:pPr>
-        <w:pStyle w:val="Compact"/>
-        <w:numPr>
-          <w:ilvl w:val="0"/>
-          <w:numId w:val="1007"/>
+        <w:t>Iteration</w:t>
+      </w:r>
+      <w:r>
+        <w:t xml:space="preserve"> — Revision loop until GCE ≥ 9</w:t>
+      </w:r>
+    </w:p>
+    <w:p>
+      <w:pPr>
+        <w:pStyle w:val="Compact"/>
+        <w:numPr>
+          <w:ilvl w:val="0"/>
+          <w:numId w:val="8"/>
         </w:numPr>
       </w:pPr>
       <w:r>
@@ -1129,47 +1104,45 @@
           <w:b/>
           <w:bCs/>
         </w:rPr>
-        <w:t xml:space="preserve">Output</w:t>
-      </w:r>
-      <w:r>
-        <w:t xml:space="preserve"> </w:t>
-      </w:r>
-      <w:r>
-        <w:t xml:space="preserve">— MusicXML only after gate passed</w:t>
-      </w:r>
-    </w:p>
-    <w:p>
-      <w:r>
-        <w:pict>
-          <v:rect style="width:0;height:1.5pt" o:hralign="center" o:hrstd="t" o:hr="t"/>
+        <w:t>Output</w:t>
+      </w:r>
+      <w:r>
+        <w:t xml:space="preserve"> — MusicXML only after gate passed</w:t>
+      </w:r>
+    </w:p>
+    <w:p>
+      <w:r>
+        <w:lastRenderedPageBreak/>
+        <w:pict w14:anchorId="77388DF7">
+          <v:rect id="_x0000_i1030" style="width:0;height:1.5pt" o:hralign="center" o:hrstd="t" o:hr="t"/>
         </w:pict>
       </w:r>
     </w:p>
-    <w:bookmarkEnd w:id="19"/>
-    <w:bookmarkStart w:id="22" w:name="integration-points"/>
     <w:p>
       <w:pPr>
         <w:pStyle w:val="Heading2"/>
       </w:pPr>
-      <w:r>
-        <w:t xml:space="preserve">Integration Points</w:t>
-      </w:r>
-    </w:p>
-    <w:bookmarkStart w:id="20" w:name="with-music"/>
+      <w:bookmarkStart w:id="12" w:name="integration-points"/>
+      <w:bookmarkEnd w:id="11"/>
+      <w:r>
+        <w:t>Integration Points</w:t>
+      </w:r>
+    </w:p>
     <w:p>
       <w:pPr>
         <w:pStyle w:val="Heading3"/>
       </w:pPr>
-      <w:r>
-        <w:t xml:space="preserve">With music/</w:t>
-      </w:r>
-    </w:p>
-    <w:p>
-      <w:pPr>
-        <w:pStyle w:val="Compact"/>
-        <w:numPr>
-          <w:ilvl w:val="0"/>
-          <w:numId w:val="1008"/>
+      <w:bookmarkStart w:id="13" w:name="with-music"/>
+      <w:r>
+        <w:t>With music/</w:t>
+      </w:r>
+    </w:p>
+    <w:p>
+      <w:pPr>
+        <w:pStyle w:val="Compact"/>
+        <w:numPr>
+          <w:ilvl w:val="0"/>
+          <w:numId w:val="9"/>
         </w:numPr>
       </w:pPr>
       <w:r>
@@ -1177,21 +1150,18 @@
           <w:b/>
           <w:bCs/>
         </w:rPr>
-        <w:t xml:space="preserve">excellence-criteria.md</w:t>
-      </w:r>
-      <w:r>
-        <w:t xml:space="preserve"> </w:t>
-      </w:r>
-      <w:r>
-        <w:t xml:space="preserve">— Shared 0–10 scale</w:t>
-      </w:r>
-    </w:p>
-    <w:p>
-      <w:pPr>
-        <w:pStyle w:val="Compact"/>
-        <w:numPr>
-          <w:ilvl w:val="0"/>
-          <w:numId w:val="1008"/>
+        <w:t>excellence-criteria.md</w:t>
+      </w:r>
+      <w:r>
+        <w:t xml:space="preserve"> — Shared 0–10 scale</w:t>
+      </w:r>
+    </w:p>
+    <w:p>
+      <w:pPr>
+        <w:pStyle w:val="Compact"/>
+        <w:numPr>
+          <w:ilvl w:val="0"/>
+          <w:numId w:val="9"/>
         </w:numPr>
       </w:pPr>
       <w:r>
@@ -1199,21 +1169,18 @@
           <w:b/>
           <w:bCs/>
         </w:rPr>
-        <w:t xml:space="preserve">engraving-rules-sibelius.md</w:t>
-      </w:r>
-      <w:r>
-        <w:t xml:space="preserve"> </w:t>
-      </w:r>
-      <w:r>
-        <w:t xml:space="preserve">— Shared engraving rules</w:t>
-      </w:r>
-    </w:p>
-    <w:p>
-      <w:pPr>
-        <w:pStyle w:val="Compact"/>
-        <w:numPr>
-          <w:ilvl w:val="0"/>
-          <w:numId w:val="1008"/>
+        <w:t>engraving-rules-sibelius.md</w:t>
+      </w:r>
+      <w:r>
+        <w:t xml:space="preserve"> — Shared engraving rules</w:t>
+      </w:r>
+    </w:p>
+    <w:p>
+      <w:pPr>
+        <w:pStyle w:val="Compact"/>
+        <w:numPr>
+          <w:ilvl w:val="0"/>
+          <w:numId w:val="9"/>
         </w:numPr>
       </w:pPr>
       <w:r>
@@ -1221,79 +1188,70 @@
           <w:b/>
           <w:bCs/>
         </w:rPr>
-        <w:t xml:space="preserve">palettes/tonality-vault/</w:t>
-      </w:r>
-      <w:r>
-        <w:t xml:space="preserve"> </w:t>
-      </w:r>
-      <w:r>
-        <w:t xml:space="preserve">— Shared harmonic framework</w:t>
-      </w:r>
-    </w:p>
-    <w:bookmarkEnd w:id="20"/>
-    <w:bookmarkStart w:id="21" w:name="with-cursor-system-pack.md"/>
+        <w:t>palettes/tonality-vault/</w:t>
+      </w:r>
+      <w:r>
+        <w:t xml:space="preserve"> — Shared harmonic framework</w:t>
+      </w:r>
+    </w:p>
     <w:p>
       <w:pPr>
         <w:pStyle w:val="Heading3"/>
       </w:pPr>
-      <w:r>
-        <w:t xml:space="preserve">With cursor-system-pack.md</w:t>
-      </w:r>
-    </w:p>
-    <w:p>
-      <w:pPr>
-        <w:pStyle w:val="Compact"/>
-        <w:numPr>
-          <w:ilvl w:val="0"/>
-          <w:numId w:val="1009"/>
-        </w:numPr>
-      </w:pPr>
-      <w:r>
-        <w:t xml:space="preserve">Mode selection can include engine name (e.g. </w:t>
-      </w:r>
-      <w:r>
-        <w:t xml:space="preserve">“Mode: Scofield–Holland”</w:t>
-      </w:r>
-      <w:r>
-        <w:t xml:space="preserve">)</w:t>
-      </w:r>
-    </w:p>
-    <w:p>
-      <w:pPr>
-        <w:pStyle w:val="Compact"/>
-        <w:numPr>
-          <w:ilvl w:val="0"/>
-          <w:numId w:val="1009"/>
-        </w:numPr>
-      </w:pPr>
-      <w:r>
-        <w:t xml:space="preserve">Master file references creative-engines for Mighty Ten projects</w:t>
-      </w:r>
-    </w:p>
-    <w:p>
-      <w:r>
-        <w:pict>
-          <v:rect style="width:0;height:1.5pt" o:hralign="center" o:hrstd="t" o:hr="t"/>
+      <w:bookmarkStart w:id="14" w:name="with-cursor-system-pack.md"/>
+      <w:bookmarkEnd w:id="13"/>
+      <w:r>
+        <w:t>With cursor-system-pack.md</w:t>
+      </w:r>
+    </w:p>
+    <w:p>
+      <w:pPr>
+        <w:pStyle w:val="Compact"/>
+        <w:numPr>
+          <w:ilvl w:val="0"/>
+          <w:numId w:val="10"/>
+        </w:numPr>
+      </w:pPr>
+      <w:r>
+        <w:t>Mode selection can include engine name (e.g. “Mode: Scofield–Holland”)</w:t>
+      </w:r>
+    </w:p>
+    <w:p>
+      <w:pPr>
+        <w:pStyle w:val="Compact"/>
+        <w:numPr>
+          <w:ilvl w:val="0"/>
+          <w:numId w:val="10"/>
+        </w:numPr>
+      </w:pPr>
+      <w:r>
+        <w:t>Master file references creative-engines for Mighty Ten projects</w:t>
+      </w:r>
+    </w:p>
+    <w:p>
+      <w:r>
+        <w:pict w14:anchorId="4FAB3151">
+          <v:rect id="_x0000_i1031" style="width:0;height:1.5pt" o:hralign="center" o:hrstd="t" o:hr="t"/>
         </w:pict>
       </w:r>
     </w:p>
-    <w:bookmarkEnd w:id="21"/>
-    <w:bookmarkEnd w:id="22"/>
-    <w:bookmarkStart w:id="23" w:name="versioning"/>
     <w:p>
       <w:pPr>
         <w:pStyle w:val="Heading2"/>
       </w:pPr>
-      <w:r>
-        <w:t xml:space="preserve">Versioning</w:t>
-      </w:r>
-    </w:p>
-    <w:p>
-      <w:pPr>
-        <w:pStyle w:val="Compact"/>
-        <w:numPr>
-          <w:ilvl w:val="0"/>
-          <w:numId w:val="1010"/>
+      <w:bookmarkStart w:id="15" w:name="versioning"/>
+      <w:bookmarkEnd w:id="12"/>
+      <w:bookmarkEnd w:id="14"/>
+      <w:r>
+        <w:t>Versioning</w:t>
+      </w:r>
+    </w:p>
+    <w:p>
+      <w:pPr>
+        <w:pStyle w:val="Compact"/>
+        <w:numPr>
+          <w:ilvl w:val="0"/>
+          <w:numId w:val="11"/>
         </w:numPr>
       </w:pPr>
       <w:r>
@@ -1301,21 +1259,18 @@
           <w:b/>
           <w:bCs/>
         </w:rPr>
-        <w:t xml:space="preserve">V1</w:t>
-      </w:r>
-      <w:r>
-        <w:t xml:space="preserve"> </w:t>
-      </w:r>
-      <w:r>
-        <w:t xml:space="preserve">— Basic user guide</w:t>
-      </w:r>
-    </w:p>
-    <w:p>
-      <w:pPr>
-        <w:pStyle w:val="Compact"/>
-        <w:numPr>
-          <w:ilvl w:val="0"/>
-          <w:numId w:val="1010"/>
+        <w:t>V1</w:t>
+      </w:r>
+      <w:r>
+        <w:t xml:space="preserve"> — Basic user guide</w:t>
+      </w:r>
+    </w:p>
+    <w:p>
+      <w:pPr>
+        <w:pStyle w:val="Compact"/>
+        <w:numPr>
+          <w:ilvl w:val="0"/>
+          <w:numId w:val="11"/>
         </w:numPr>
       </w:pPr>
       <w:r>
@@ -1323,21 +1278,18 @@
           <w:b/>
           <w:bCs/>
         </w:rPr>
-        <w:t xml:space="preserve">V2</w:t>
-      </w:r>
-      <w:r>
-        <w:t xml:space="preserve"> </w:t>
-      </w:r>
-      <w:r>
-        <w:t xml:space="preserve">— Extended guide (matrix, prompts, orchestration)</w:t>
-      </w:r>
-    </w:p>
-    <w:p>
-      <w:pPr>
-        <w:pStyle w:val="Compact"/>
-        <w:numPr>
-          <w:ilvl w:val="0"/>
-          <w:numId w:val="1010"/>
+        <w:t>V2</w:t>
+      </w:r>
+      <w:r>
+        <w:t xml:space="preserve"> — Extended guide (matrix, prompts, orchestration)</w:t>
+      </w:r>
+    </w:p>
+    <w:p>
+      <w:pPr>
+        <w:pStyle w:val="Compact"/>
+        <w:numPr>
+          <w:ilvl w:val="0"/>
+          <w:numId w:val="11"/>
         </w:numPr>
       </w:pPr>
       <w:r>
@@ -1345,19 +1297,16 @@
           <w:b/>
           <w:bCs/>
         </w:rPr>
-        <w:t xml:space="preserve">V3</w:t>
-      </w:r>
-      <w:r>
-        <w:t xml:space="preserve"> </w:t>
-      </w:r>
-      <w:r>
-        <w:t xml:space="preserve">— Architecture guide (this document)</w:t>
-      </w:r>
-    </w:p>
-    <w:p>
-      <w:r>
-        <w:pict>
-          <v:rect style="width:0;height:1.5pt" o:hralign="center" o:hrstd="t" o:hr="t"/>
+        <w:t>V3</w:t>
+      </w:r>
+      <w:r>
+        <w:t xml:space="preserve"> — Architecture guide (this document)</w:t>
+      </w:r>
+    </w:p>
+    <w:p>
+      <w:r>
+        <w:pict w14:anchorId="758FE28A">
+          <v:rect id="_x0000_i1032" style="width:0;height:1.5pt" o:hralign="center" o:hrstd="t" o:hr="t"/>
         </w:pict>
       </w:r>
     </w:p>
@@ -1370,48 +1319,29 @@
           <w:i/>
           <w:iCs/>
         </w:rPr>
-        <w:t xml:space="preserve">This repository is the canonical source of creative excellence standards.</w:t>
-      </w:r>
-    </w:p>
-    <w:bookmarkEnd w:id="23"/>
-    <w:bookmarkEnd w:id="24"/>
+        <w:t>This repository is the canonical source of creative excellence standards.</w:t>
+      </w:r>
+      <w:bookmarkEnd w:id="0"/>
+      <w:bookmarkEnd w:id="15"/>
+    </w:p>
     <w:sectPr>
       <w:footnotePr>
         <w:numRestart w:val="eachSect"/>
       </w:footnotePr>
+      <w:pgSz w:w="12240" w:h="15840"/>
+      <w:pgMar w:top="1440" w:right="1440" w:bottom="1440" w:left="1440" w:header="720" w:footer="720" w:gutter="0"/>
+      <w:cols w:space="720"/>
     </w:sectPr>
   </w:body>
 </w:document>
 </file>
 
-<file path=word/comments.xml><?xml version="1.0" encoding="utf-8"?>
-<w:comments xmlns:w="http://schemas.openxmlformats.org/wordprocessingml/2006/main" xmlns:m="http://schemas.openxmlformats.org/officeDocument/2006/math" xmlns:r="http://schemas.openxmlformats.org/officeDocument/2006/relationships" xmlns:o="urn:schemas-microsoft-com:office:office" xmlns:v="urn:schemas-microsoft-com:vml" xmlns:w10="urn:schemas-microsoft-com:office:word" xmlns:a="http://schemas.openxmlformats.org/drawingml/2006/main" xmlns:pic="http://schemas.openxmlformats.org/drawingml/2006/picture" xmlns:wp="http://schemas.openxmlformats.org/drawingml/2006/wordprocessingDrawing"/>
-</file>
-
-<file path=word/footnotes.xml><?xml version="1.0" encoding="utf-8"?>
-<w:footnotes xmlns:w="http://schemas.openxmlformats.org/wordprocessingml/2006/main" xmlns:m="http://schemas.openxmlformats.org/officeDocument/2006/math" xmlns:r="http://schemas.openxmlformats.org/officeDocument/2006/relationships" xmlns:o="urn:schemas-microsoft-com:office:office" xmlns:v="urn:schemas-microsoft-com:vml" xmlns:w10="urn:schemas-microsoft-com:office:word" xmlns:a="http://schemas.openxmlformats.org/drawingml/2006/main" xmlns:pic="http://schemas.openxmlformats.org/drawingml/2006/picture" xmlns:wp="http://schemas.openxmlformats.org/drawingml/2006/wordprocessingDrawing">
-  <w:footnote w:type="continuationSeparator" w:id="0">
-    <w:p>
-      <w:r>
-        <w:continuationSeparator/>
-      </w:r>
-    </w:p>
-  </w:footnote>
-  <w:footnote w:type="separator" w:id="-1">
-    <w:p>
-      <w:r>
-        <w:separator/>
-      </w:r>
-    </w:p>
-  </w:footnote>
-</w:footnotes>
-</file>
-
 <file path=word/numbering.xml><?xml version="1.0" encoding="utf-8"?>
-<w:numbering xmlns:w="http://schemas.openxmlformats.org/wordprocessingml/2006/main">
-  <w:abstractNum w:abstractNumId="990">
+<w:numbering xmlns:wpc="http://schemas.microsoft.com/office/word/2010/wordprocessingCanvas" xmlns:cx="http://schemas.microsoft.com/office/drawing/2014/chartex" xmlns:cx1="http://schemas.microsoft.com/office/drawing/2015/9/8/chartex" xmlns:cx2="http://schemas.microsoft.com/office/drawing/2015/10/21/chartex" xmlns:cx3="http://schemas.microsoft.com/office/drawing/2016/5/9/chartex" xmlns:cx4="http://schemas.microsoft.com/office/drawing/2016/5/10/chartex" xmlns:cx5="http://schemas.microsoft.com/office/drawing/2016/5/11/chartex" xmlns:cx6="http://schemas.microsoft.com/office/drawing/2016/5/12/chartex" xmlns:cx7="http://schemas.microsoft.com/office/drawing/2016/5/13/chartex" xmlns:cx8="http://schemas.microsoft.com/office/drawing/2016/5/14/chartex" xmlns:mc="http://schemas.openxmlformats.org/markup-compatibility/2006" xmlns:aink="http://schemas.microsoft.com/office/drawing/2016/ink" xmlns:am3d="http://schemas.microsoft.com/office/drawing/2017/model3d" xmlns:o="urn:schemas-microsoft-com:office:office" xmlns:oel="http://schemas.microsoft.com/office/2019/extlst" xmlns:r="http://schemas.openxmlformats.org/officeDocument/2006/relationships" xmlns:m="http://schemas.openxmlformats.org/officeDocument/2006/math" xmlns:v="urn:schemas-microsoft-com:vml" xmlns:wp14="http://schemas.microsoft.com/office/word/2010/wordprocessingDrawing" xmlns:wp="http://schemas.openxmlformats.org/drawingml/2006/wordprocessingDrawing" xmlns:w10="urn:schemas-microsoft-com:office:word" xmlns:w="http://schemas.openxmlformats.org/wordprocessingml/2006/main" xmlns:w14="http://schemas.microsoft.com/office/word/2010/wordml" xmlns:w15="http://schemas.microsoft.com/office/word/2012/wordml" xmlns:w16cex="http://schemas.microsoft.com/office/word/2018/wordml/cex" xmlns:w16cid="http://schemas.microsoft.com/office/word/2016/wordml/cid" xmlns:w16="http://schemas.microsoft.com/office/word/2018/wordml" xmlns:w16du="http://schemas.microsoft.com/office/word/2023/wordml/word16du" xmlns:w16sdtdh="http://schemas.microsoft.com/office/word/2020/wordml/sdtdatahash" xmlns:w16sdtfl="http://schemas.microsoft.com/office/word/2024/wordml/sdtformatlock" xmlns:w16se="http://schemas.microsoft.com/office/word/2015/wordml/symex" xmlns:wpg="http://schemas.microsoft.com/office/word/2010/wordprocessingGroup" xmlns:wpi="http://schemas.microsoft.com/office/word/2010/wordprocessingInk" xmlns:wne="http://schemas.microsoft.com/office/word/2006/wordml" xmlns:wps="http://schemas.microsoft.com/office/word/2010/wordprocessingShape" mc:Ignorable="w14 w15 w16se w16cid w16 w16cex w16sdtdh w16sdtfl w16du wp14">
+  <w:abstractNum w:abstractNumId="0" w15:restartNumberingAfterBreak="0">
     <w:nsid w:val="0000A990"/>
     <w:multiLevelType w:val="multilevel"/>
+    <w:tmpl w:val="D06AECC0"/>
     <w:lvl w:ilvl="0">
       <w:numFmt w:val="bullet"/>
       <w:lvlText w:val=" "/>
@@ -1485,9 +1415,10 @@
       </w:pPr>
     </w:lvl>
   </w:abstractNum>
-  <w:abstractNum w:abstractNumId="991">
+  <w:abstractNum w:abstractNumId="1" w15:restartNumberingAfterBreak="0">
     <w:nsid w:val="0000A991"/>
     <w:multiLevelType w:val="multilevel"/>
+    <w:tmpl w:val="11ECDC7A"/>
     <w:lvl w:ilvl="0">
       <w:numFmt w:val="bullet"/>
       <w:lvlText w:val=""/>
@@ -1588,9 +1519,10 @@
       </w:rPr>
     </w:lvl>
   </w:abstractNum>
-  <w:abstractNum w:abstractNumId="99411">
+  <w:abstractNum w:abstractNumId="2" w15:restartNumberingAfterBreak="0">
     <w:nsid w:val="00A99411"/>
     <w:multiLevelType w:val="multilevel"/>
+    <w:tmpl w:val="705E5D04"/>
     <w:lvl w:ilvl="0">
       <w:start w:val="1"/>
       <w:numFmt w:val="decimal"/>
@@ -1673,26 +1605,26 @@
       </w:pPr>
     </w:lvl>
   </w:abstractNum>
-  <w:num w:numId="1000">
-    <w:abstractNumId w:val="990"/>
+  <w:num w:numId="1" w16cid:durableId="2075736186">
+    <w:abstractNumId w:val="0"/>
   </w:num>
-  <w:num w:numId="1001">
-    <w:abstractNumId w:val="991"/>
+  <w:num w:numId="2" w16cid:durableId="1428235860">
+    <w:abstractNumId w:val="1"/>
   </w:num>
-  <w:num w:numId="1002">
-    <w:abstractNumId w:val="991"/>
+  <w:num w:numId="3" w16cid:durableId="2022924691">
+    <w:abstractNumId w:val="1"/>
   </w:num>
-  <w:num w:numId="1003">
-    <w:abstractNumId w:val="991"/>
+  <w:num w:numId="4" w16cid:durableId="899168907">
+    <w:abstractNumId w:val="1"/>
   </w:num>
-  <w:num w:numId="1004">
-    <w:abstractNumId w:val="991"/>
+  <w:num w:numId="5" w16cid:durableId="1179392601">
+    <w:abstractNumId w:val="1"/>
   </w:num>
-  <w:num w:numId="1005">
-    <w:abstractNumId w:val="991"/>
+  <w:num w:numId="6" w16cid:durableId="421069252">
+    <w:abstractNumId w:val="1"/>
   </w:num>
-  <w:num w:numId="1006">
-    <w:abstractNumId w:val="99411"/>
+  <w:num w:numId="7" w16cid:durableId="449591607">
+    <w:abstractNumId w:val="2"/>
     <w:lvlOverride w:ilvl="0">
       <w:startOverride w:val="1"/>
     </w:lvlOverride>
@@ -1721,8 +1653,8 @@
       <w:startOverride w:val="1"/>
     </w:lvlOverride>
   </w:num>
-  <w:num w:numId="1007">
-    <w:abstractNumId w:val="99411"/>
+  <w:num w:numId="8" w16cid:durableId="1180393285">
+    <w:abstractNumId w:val="2"/>
     <w:lvlOverride w:ilvl="0">
       <w:startOverride w:val="1"/>
     </w:lvlOverride>
@@ -1751,27 +1683,27 @@
       <w:startOverride w:val="1"/>
     </w:lvlOverride>
   </w:num>
-  <w:num w:numId="1008">
-    <w:abstractNumId w:val="991"/>
+  <w:num w:numId="9" w16cid:durableId="1451046556">
+    <w:abstractNumId w:val="1"/>
   </w:num>
-  <w:num w:numId="1009">
-    <w:abstractNumId w:val="991"/>
+  <w:num w:numId="10" w16cid:durableId="309017885">
+    <w:abstractNumId w:val="1"/>
   </w:num>
-  <w:num w:numId="1010">
-    <w:abstractNumId w:val="991"/>
+  <w:num w:numId="11" w16cid:durableId="916671133">
+    <w:abstractNumId w:val="1"/>
   </w:num>
 </w:numbering>
 </file>
 
 <file path=word/styles.xml><?xml version="1.0" encoding="utf-8"?>
-<w:styles xmlns:r="http://schemas.openxmlformats.org/officeDocument/2006/relationships" xmlns:w="http://schemas.openxmlformats.org/wordprocessingml/2006/main">
+<w:styles xmlns:mc="http://schemas.openxmlformats.org/markup-compatibility/2006" xmlns:r="http://schemas.openxmlformats.org/officeDocument/2006/relationships" xmlns:w="http://schemas.openxmlformats.org/wordprocessingml/2006/main" xmlns:w14="http://schemas.microsoft.com/office/word/2010/wordml" xmlns:w15="http://schemas.microsoft.com/office/word/2012/wordml" xmlns:w16cex="http://schemas.microsoft.com/office/word/2018/wordml/cex" xmlns:w16cid="http://schemas.microsoft.com/office/word/2016/wordml/cid" xmlns:w16="http://schemas.microsoft.com/office/word/2018/wordml" xmlns:w16du="http://schemas.microsoft.com/office/word/2023/wordml/word16du" xmlns:w16sdtdh="http://schemas.microsoft.com/office/word/2020/wordml/sdtdatahash" xmlns:w16sdtfl="http://schemas.microsoft.com/office/word/2024/wordml/sdtformatlock" xmlns:w16se="http://schemas.microsoft.com/office/word/2015/wordml/symex" mc:Ignorable="w14 w15 w16se w16cid w16 w16cex w16sdtdh w16sdtfl w16du">
   <w:docDefaults>
     <w:rPrDefault>
       <w:rPr>
-        <w:rFonts w:asciiTheme="minorHAnsi" w:cstheme="minorBidi" w:eastAsiaTheme="minorEastAsia" w:hAnsiTheme="minorHAnsi"/>
+        <w:rFonts w:asciiTheme="minorHAnsi" w:eastAsiaTheme="minorEastAsia" w:hAnsiTheme="minorHAnsi" w:cstheme="minorBidi"/>
         <w:sz w:val="24"/>
         <w:szCs w:val="24"/>
-        <w:lang w:bidi="ar-SA" w:eastAsia="zh-CN" w:val="en-US"/>
+        <w:lang w:val="en-US" w:eastAsia="zh-CN" w:bidi="ar-SA"/>
       </w:rPr>
     </w:rPrDefault>
     <w:pPrDefault>
@@ -1780,168 +1712,255 @@
       </w:pPr>
     </w:pPrDefault>
   </w:docDefaults>
-  <w:latentStyles w:count="276" w:defLockedState="0" w:defQFormat="0" w:defSemiHidden="0" w:defUIPriority="0" w:defUnhideWhenUsed="0"/>
-  <w:style w:default="1" w:styleId="Normal" w:type="paragraph">
+  <w:latentStyles w:defLockedState="0" w:defUIPriority="0" w:defSemiHidden="0" w:defUnhideWhenUsed="0" w:defQFormat="0" w:count="376">
+    <w:lsdException w:name="Normal Table" w:semiHidden="1" w:unhideWhenUsed="1"/>
+    <w:lsdException w:name="Table Simple 1" w:semiHidden="1" w:unhideWhenUsed="1"/>
+    <w:lsdException w:name="Table Simple 2" w:semiHidden="1" w:unhideWhenUsed="1"/>
+    <w:lsdException w:name="Table Simple 3" w:semiHidden="1" w:unhideWhenUsed="1"/>
+    <w:lsdException w:name="Table Classic 1" w:semiHidden="1" w:unhideWhenUsed="1"/>
+    <w:lsdException w:name="Table Classic 2" w:semiHidden="1" w:unhideWhenUsed="1"/>
+    <w:lsdException w:name="Table Classic 3" w:semiHidden="1" w:unhideWhenUsed="1"/>
+    <w:lsdException w:name="Table Classic 4" w:semiHidden="1" w:unhideWhenUsed="1"/>
+    <w:lsdException w:name="Table Colorful 1" w:semiHidden="1" w:unhideWhenUsed="1"/>
+    <w:lsdException w:name="Table Colorful 2" w:semiHidden="1" w:unhideWhenUsed="1"/>
+    <w:lsdException w:name="Table Colorful 3" w:semiHidden="1" w:unhideWhenUsed="1"/>
+    <w:lsdException w:name="Table Columns 1" w:semiHidden="1" w:unhideWhenUsed="1"/>
+    <w:lsdException w:name="Table Columns 2" w:semiHidden="1" w:unhideWhenUsed="1"/>
+    <w:lsdException w:name="Table Columns 3" w:semiHidden="1" w:unhideWhenUsed="1"/>
+    <w:lsdException w:name="Table Columns 4" w:semiHidden="1" w:unhideWhenUsed="1"/>
+    <w:lsdException w:name="Table Columns 5" w:semiHidden="1" w:unhideWhenUsed="1"/>
+    <w:lsdException w:name="Table Grid 1" w:semiHidden="1" w:unhideWhenUsed="1"/>
+    <w:lsdException w:name="Table Grid 2" w:semiHidden="1" w:unhideWhenUsed="1"/>
+    <w:lsdException w:name="Table Grid 3" w:semiHidden="1" w:unhideWhenUsed="1"/>
+    <w:lsdException w:name="Table Grid 4" w:semiHidden="1" w:unhideWhenUsed="1"/>
+    <w:lsdException w:name="Table Grid 5" w:semiHidden="1" w:unhideWhenUsed="1"/>
+    <w:lsdException w:name="Table Grid 6" w:semiHidden="1" w:unhideWhenUsed="1"/>
+    <w:lsdException w:name="Table Grid 7" w:semiHidden="1" w:unhideWhenUsed="1"/>
+    <w:lsdException w:name="Table Grid 8" w:semiHidden="1" w:unhideWhenUsed="1"/>
+    <w:lsdException w:name="Table List 1" w:semiHidden="1" w:unhideWhenUsed="1"/>
+    <w:lsdException w:name="Table List 2" w:semiHidden="1" w:unhideWhenUsed="1"/>
+    <w:lsdException w:name="Table List 3" w:semiHidden="1" w:unhideWhenUsed="1"/>
+    <w:lsdException w:name="Table List 4" w:semiHidden="1" w:unhideWhenUsed="1"/>
+    <w:lsdException w:name="Table List 5" w:semiHidden="1" w:unhideWhenUsed="1"/>
+    <w:lsdException w:name="Table List 6" w:semiHidden="1" w:unhideWhenUsed="1"/>
+    <w:lsdException w:name="Table List 7" w:semiHidden="1" w:unhideWhenUsed="1"/>
+    <w:lsdException w:name="Table List 8" w:semiHidden="1" w:unhideWhenUsed="1"/>
+    <w:lsdException w:name="Table 3D effects 1" w:semiHidden="1" w:unhideWhenUsed="1"/>
+    <w:lsdException w:name="Table 3D effects 2" w:semiHidden="1" w:unhideWhenUsed="1"/>
+    <w:lsdException w:name="Table 3D effects 3" w:semiHidden="1" w:unhideWhenUsed="1"/>
+    <w:lsdException w:name="Table Contemporary" w:semiHidden="1" w:unhideWhenUsed="1"/>
+    <w:lsdException w:name="Table Elegant" w:semiHidden="1" w:unhideWhenUsed="1"/>
+    <w:lsdException w:name="Table Professional" w:semiHidden="1" w:unhideWhenUsed="1"/>
+    <w:lsdException w:name="Table Subtle 1" w:semiHidden="1" w:unhideWhenUsed="1"/>
+    <w:lsdException w:name="Table Subtle 2" w:semiHidden="1" w:unhideWhenUsed="1"/>
+    <w:lsdException w:name="Table Web 1" w:semiHidden="1" w:unhideWhenUsed="1"/>
+    <w:lsdException w:name="Table Web 2" w:semiHidden="1" w:unhideWhenUsed="1"/>
+    <w:lsdException w:name="Table Web 3" w:semiHidden="1" w:unhideWhenUsed="1"/>
+    <w:lsdException w:name="Table Theme" w:semiHidden="1" w:unhideWhenUsed="1"/>
+    <w:lsdException w:name="Light Shading"/>
+    <w:lsdException w:name="Light List"/>
+    <w:lsdException w:name="Light Grid"/>
+    <w:lsdException w:name="Medium Shading 1"/>
+    <w:lsdException w:name="Medium Shading 2"/>
+    <w:lsdException w:name="Medium List 1"/>
+    <w:lsdException w:name="Medium List 2"/>
+    <w:lsdException w:name="Medium Grid 1"/>
+    <w:lsdException w:name="Medium Grid 2"/>
+    <w:lsdException w:name="Medium Grid 3"/>
+    <w:lsdException w:name="Dark List"/>
+    <w:lsdException w:name="Colorful Shading"/>
+    <w:lsdException w:name="Colorful List"/>
+    <w:lsdException w:name="Colorful Grid"/>
+    <w:lsdException w:name="Light Shading Accent 1"/>
+    <w:lsdException w:name="Light List Accent 1"/>
+    <w:lsdException w:name="Light Grid Accent 1"/>
+    <w:lsdException w:name="Medium Shading 1 Accent 1"/>
+    <w:lsdException w:name="Medium Shading 2 Accent 1"/>
+    <w:lsdException w:name="Medium List 1 Accent 1"/>
+    <w:lsdException w:name="Medium List 2 Accent 1"/>
+    <w:lsdException w:name="Medium Grid 1 Accent 1"/>
+    <w:lsdException w:name="Medium Grid 2 Accent 1"/>
+    <w:lsdException w:name="Medium Grid 3 Accent 1"/>
+    <w:lsdException w:name="Dark List Accent 1"/>
+    <w:lsdException w:name="Colorful Shading Accent 1"/>
+    <w:lsdException w:name="Colorful List Accent 1"/>
+    <w:lsdException w:name="Colorful Grid Accent 1"/>
+    <w:lsdException w:name="Light Shading Accent 2"/>
+    <w:lsdException w:name="Light List Accent 2"/>
+    <w:lsdException w:name="Light Grid Accent 2"/>
+    <w:lsdException w:name="Medium Shading 1 Accent 2"/>
+    <w:lsdException w:name="Medium Shading 2 Accent 2"/>
+    <w:lsdException w:name="Medium List 1 Accent 2"/>
+    <w:lsdException w:name="Medium List 2 Accent 2"/>
+    <w:lsdException w:name="Medium Grid 1 Accent 2"/>
+    <w:lsdException w:name="Medium Grid 2 Accent 2"/>
+    <w:lsdException w:name="Medium Grid 3 Accent 2"/>
+    <w:lsdException w:name="Dark List Accent 2"/>
+    <w:lsdException w:name="Colorful Shading Accent 2"/>
+    <w:lsdException w:name="Colorful List Accent 2"/>
+    <w:lsdException w:name="Colorful Grid Accent 2"/>
+    <w:lsdException w:name="Light Shading Accent 3"/>
+    <w:lsdException w:name="Light List Accent 3"/>
+    <w:lsdException w:name="Light Grid Accent 3"/>
+    <w:lsdException w:name="Medium Shading 1 Accent 3"/>
+    <w:lsdException w:name="Medium Shading 2 Accent 3"/>
+    <w:lsdException w:name="Medium List 1 Accent 3"/>
+    <w:lsdException w:name="Medium List 2 Accent 3"/>
+    <w:lsdException w:name="Medium Grid 1 Accent 3"/>
+    <w:lsdException w:name="Medium Grid 2 Accent 3"/>
+    <w:lsdException w:name="Medium Grid 3 Accent 3"/>
+    <w:lsdException w:name="Dark List Accent 3"/>
+    <w:lsdException w:name="Colorful Shading Accent 3"/>
+    <w:lsdException w:name="Colorful List Accent 3"/>
+    <w:lsdException w:name="Colorful Grid Accent 3"/>
+    <w:lsdException w:name="Light Shading Accent 4"/>
+    <w:lsdException w:name="Light List Accent 4"/>
+    <w:lsdException w:name="Light Grid Accent 4"/>
+    <w:lsdException w:name="Medium Shading 1 Accent 4"/>
+    <w:lsdException w:name="Medium Shading 2 Accent 4"/>
+    <w:lsdException w:name="Medium List 1 Accent 4"/>
+    <w:lsdException w:name="Medium List 2 Accent 4"/>
+    <w:lsdException w:name="Medium Grid 1 Accent 4"/>
+    <w:lsdException w:name="Medium Grid 2 Accent 4"/>
+    <w:lsdException w:name="Medium Grid 3 Accent 4"/>
+    <w:lsdException w:name="Dark List Accent 4"/>
+    <w:lsdException w:name="Colorful Shading Accent 4"/>
+    <w:lsdException w:name="Colorful List Accent 4"/>
+    <w:lsdException w:name="Colorful Grid Accent 4"/>
+    <w:lsdException w:name="Light Shading Accent 5"/>
+    <w:lsdException w:name="Light List Accent 5"/>
+    <w:lsdException w:name="Light Grid Accent 5"/>
+    <w:lsdException w:name="Medium Shading 1 Accent 5"/>
+    <w:lsdException w:name="Medium Shading 2 Accent 5"/>
+    <w:lsdException w:name="Medium List 1 Accent 5"/>
+    <w:lsdException w:name="Medium List 2 Accent 5"/>
+    <w:lsdException w:name="Medium Grid 1 Accent 5"/>
+    <w:lsdException w:name="Medium Grid 2 Accent 5"/>
+    <w:lsdException w:name="Medium Grid 3 Accent 5"/>
+    <w:lsdException w:name="Dark List Accent 5"/>
+    <w:lsdException w:name="Colorful Shading Accent 5"/>
+    <w:lsdException w:name="Colorful List Accent 5"/>
+    <w:lsdException w:name="Colorful Grid Accent 5"/>
+    <w:lsdException w:name="Light Shading Accent 6"/>
+    <w:lsdException w:name="Light List Accent 6"/>
+    <w:lsdException w:name="Light Grid Accent 6"/>
+    <w:lsdException w:name="Medium Shading 1 Accent 6"/>
+    <w:lsdException w:name="Medium Shading 2 Accent 6"/>
+    <w:lsdException w:name="Medium List 1 Accent 6"/>
+    <w:lsdException w:name="Medium List 2 Accent 6"/>
+    <w:lsdException w:name="Medium Grid 1 Accent 6"/>
+    <w:lsdException w:name="Medium Grid 2 Accent 6"/>
+    <w:lsdException w:name="Medium Grid 3 Accent 6"/>
+    <w:lsdException w:name="Dark List Accent 6"/>
+    <w:lsdException w:name="Colorful Shading Accent 6"/>
+    <w:lsdException w:name="Colorful List Accent 6"/>
+    <w:lsdException w:name="Colorful Grid Accent 6"/>
+    <w:lsdException w:name="Grid Table 4" w:uiPriority="49"/>
+    <w:lsdException w:name="Grid Table 5 Dark" w:uiPriority="50"/>
+    <w:lsdException w:name="Grid Table 6 Colorful" w:uiPriority="51"/>
+    <w:lsdException w:name="Grid Table 7 Colorful" w:uiPriority="52"/>
+    <w:lsdException w:name="Grid Table 1 Light Accent 1" w:uiPriority="46"/>
+    <w:lsdException w:name="Grid Table 2 Accent 1" w:uiPriority="47"/>
+    <w:lsdException w:name="Grid Table 3 Accent 1" w:uiPriority="48"/>
+    <w:lsdException w:name="Grid Table 4 Accent 1" w:uiPriority="49"/>
+    <w:lsdException w:name="Grid Table 5 Dark Accent 1" w:uiPriority="50"/>
+    <w:lsdException w:name="Grid Table 6 Colorful Accent 1" w:uiPriority="51"/>
+    <w:lsdException w:name="Grid Table 7 Colorful Accent 1" w:uiPriority="52"/>
+    <w:lsdException w:name="Grid Table 1 Light Accent 2" w:uiPriority="46"/>
+    <w:lsdException w:name="Grid Table 2 Accent 2" w:uiPriority="47"/>
+    <w:lsdException w:name="Grid Table 3 Accent 2" w:uiPriority="48"/>
+    <w:lsdException w:name="Grid Table 4 Accent 2" w:uiPriority="49"/>
+    <w:lsdException w:name="Grid Table 5 Dark Accent 2" w:uiPriority="50"/>
+    <w:lsdException w:name="Grid Table 6 Colorful Accent 2" w:uiPriority="51"/>
+    <w:lsdException w:name="Grid Table 7 Colorful Accent 2" w:uiPriority="52"/>
+    <w:lsdException w:name="Grid Table 1 Light Accent 3" w:uiPriority="46"/>
+    <w:lsdException w:name="Grid Table 2 Accent 3" w:uiPriority="47"/>
+    <w:lsdException w:name="Grid Table 3 Accent 3" w:uiPriority="48"/>
+    <w:lsdException w:name="Grid Table 4 Accent 3" w:uiPriority="49"/>
+    <w:lsdException w:name="Grid Table 5 Dark Accent 3" w:uiPriority="50"/>
+    <w:lsdException w:name="Grid Table 6 Colorful Accent 3" w:uiPriority="51"/>
+    <w:lsdException w:name="Grid Table 7 Colorful Accent 3" w:uiPriority="52"/>
+    <w:lsdException w:name="Grid Table 1 Light Accent 4" w:uiPriority="46"/>
+    <w:lsdException w:name="Grid Table 2 Accent 4" w:uiPriority="47"/>
+    <w:lsdException w:name="Grid Table 3 Accent 4" w:uiPriority="48"/>
+    <w:lsdException w:name="Grid Table 4 Accent 4" w:uiPriority="49"/>
+    <w:lsdException w:name="Grid Table 5 Dark Accent 4" w:uiPriority="50"/>
+    <w:lsdException w:name="Grid Table 6 Colorful Accent 4" w:uiPriority="51"/>
+    <w:lsdException w:name="Grid Table 7 Colorful Accent 4" w:uiPriority="52"/>
+    <w:lsdException w:name="Grid Table 1 Light Accent 5" w:uiPriority="46"/>
+    <w:lsdException w:name="Grid Table 2 Accent 5" w:uiPriority="47"/>
+    <w:lsdException w:name="Grid Table 3 Accent 5" w:uiPriority="48"/>
+    <w:lsdException w:name="Grid Table 4 Accent 5" w:uiPriority="49"/>
+    <w:lsdException w:name="Grid Table 5 Dark Accent 5" w:uiPriority="50"/>
+    <w:lsdException w:name="Grid Table 6 Colorful Accent 5" w:uiPriority="51"/>
+    <w:lsdException w:name="Grid Table 7 Colorful Accent 5" w:uiPriority="52"/>
+    <w:lsdException w:name="Grid Table 1 Light Accent 6" w:uiPriority="46"/>
+    <w:lsdException w:name="Grid Table 2 Accent 6" w:uiPriority="47"/>
+    <w:lsdException w:name="Grid Table 3 Accent 6" w:uiPriority="48"/>
+    <w:lsdException w:name="Grid Table 4 Accent 6" w:uiPriority="49"/>
+    <w:lsdException w:name="Grid Table 5 Dark Accent 6" w:uiPriority="50"/>
+    <w:lsdException w:name="Grid Table 6 Colorful Accent 6" w:uiPriority="51"/>
+    <w:lsdException w:name="Grid Table 7 Colorful Accent 6" w:uiPriority="52"/>
+    <w:lsdException w:name="List Table 1 Light" w:uiPriority="46"/>
+    <w:lsdException w:name="List Table 2" w:uiPriority="47"/>
+    <w:lsdException w:name="List Table 3" w:uiPriority="48"/>
+    <w:lsdException w:name="List Table 4" w:uiPriority="49"/>
+    <w:lsdException w:name="List Table 5 Dark" w:uiPriority="50"/>
+    <w:lsdException w:name="List Table 6 Colorful" w:uiPriority="51"/>
+    <w:lsdException w:name="List Table 7 Colorful" w:uiPriority="52"/>
+    <w:lsdException w:name="List Table 1 Light Accent 1" w:uiPriority="46"/>
+    <w:lsdException w:name="List Table 2 Accent 1" w:uiPriority="47"/>
+    <w:lsdException w:name="List Table 3 Accent 1" w:uiPriority="48"/>
+    <w:lsdException w:name="List Table 4 Accent 1" w:uiPriority="49"/>
+    <w:lsdException w:name="List Table 5 Dark Accent 1" w:uiPriority="50"/>
+    <w:lsdException w:name="List Table 6 Colorful Accent 1" w:uiPriority="51"/>
+    <w:lsdException w:name="List Table 7 Colorful Accent 1" w:uiPriority="52"/>
+    <w:lsdException w:name="List Table 1 Light Accent 2" w:uiPriority="46"/>
+    <w:lsdException w:name="List Table 2 Accent 2" w:uiPriority="47"/>
+    <w:lsdException w:name="List Table 3 Accent 2" w:uiPriority="48"/>
+    <w:lsdException w:name="List Table 4 Accent 2" w:uiPriority="49"/>
+    <w:lsdException w:name="List Table 5 Dark Accent 2" w:uiPriority="50"/>
+    <w:lsdException w:name="List Table 6 Colorful Accent 2" w:uiPriority="51"/>
+    <w:lsdException w:name="List Table 7 Colorful Accent 2" w:uiPriority="52"/>
+    <w:lsdException w:name="List Table 1 Light Accent 3" w:uiPriority="46"/>
+    <w:lsdException w:name="List Table 2 Accent 3" w:uiPriority="47"/>
+    <w:lsdException w:name="List Table 3 Accent 3" w:uiPriority="48"/>
+    <w:lsdException w:name="List Table 4 Accent 3" w:uiPriority="49"/>
+    <w:lsdException w:name="List Table 5 Dark Accent 3" w:uiPriority="50"/>
+    <w:lsdException w:name="List Table 6 Colorful Accent 3" w:uiPriority="51"/>
+    <w:lsdException w:name="List Table 7 Colorful Accent 3" w:uiPriority="52"/>
+    <w:lsdException w:name="List Table 1 Light Accent 4" w:uiPriority="46"/>
+    <w:lsdException w:name="List Table 2 Accent 4" w:uiPriority="47"/>
+    <w:lsdException w:name="List Table 3 Accent 4" w:uiPriority="48"/>
+    <w:lsdException w:name="List Table 4 Accent 4" w:uiPriority="49"/>
+    <w:lsdException w:name="List Table 5 Dark Accent 4" w:uiPriority="50"/>
+    <w:lsdException w:name="List Table 6 Colorful Accent 4" w:uiPriority="51"/>
+    <w:lsdException w:name="List Table 7 Colorful Accent 4" w:uiPriority="52"/>
+    <w:lsdException w:name="List Table 1 Light Accent 5" w:uiPriority="46"/>
+    <w:lsdException w:name="List Table 2 Accent 5" w:uiPriority="47"/>
+    <w:lsdException w:name="List Table 3 Accent 5" w:uiPriority="48"/>
+    <w:lsdException w:name="List Table 4 Accent 5" w:uiPriority="49"/>
+    <w:lsdException w:name="List Table 5 Dark Accent 5" w:uiPriority="50"/>
+    <w:lsdException w:name="List Table 6 Colorful Accent 5" w:uiPriority="51"/>
+    <w:lsdException w:name="List Table 7 Colorful Accent 5" w:uiPriority="52"/>
+    <w:lsdException w:name="List Table 1 Light Accent 6" w:uiPriority="46"/>
+    <w:lsdException w:name="List Table 2 Accent 6" w:uiPriority="47"/>
+    <w:lsdException w:name="List Table 3 Accent 6" w:uiPriority="48"/>
+    <w:lsdException w:name="List Table 4 Accent 6" w:uiPriority="49"/>
+    <w:lsdException w:name="List Table 5 Dark Accent 6" w:uiPriority="50"/>
+    <w:lsdException w:name="List Table 6 Colorful Accent 6" w:uiPriority="51"/>
+    <w:lsdException w:name="List Table 7 Colorful Accent 6" w:uiPriority="52"/>
+    <w:lsdException w:name="Mention" w:semiHidden="1" w:uiPriority="99" w:unhideWhenUsed="1"/>
+    <w:lsdException w:name="Smart Hyperlink" w:semiHidden="1" w:uiPriority="99" w:unhideWhenUsed="1"/>
+    <w:lsdException w:name="Hashtag" w:semiHidden="1" w:uiPriority="99" w:unhideWhenUsed="1"/>
+    <w:lsdException w:name="Unresolved Mention" w:semiHidden="1" w:uiPriority="99" w:unhideWhenUsed="1"/>
+    <w:lsdException w:name="Smart Link" w:semiHidden="1" w:uiPriority="99" w:unhideWhenUsed="1"/>
+  </w:latentStyles>
+  <w:style w:type="paragraph" w:default="1" w:styleId="Normal">
     <w:name w:val="Normal"/>
     <w:qFormat/>
   </w:style>
-  <w:style w:styleId="BodyText" w:type="paragraph">
-    <w:name w:val="Body Text"/>
-    <w:basedOn w:val="Normal"/>
-    <w:link w:val="BodyTextChar"/>
-    <w:qFormat/>
-    <w:pPr>
-      <w:spacing w:after="180" w:before="180"/>
-    </w:pPr>
-  </w:style>
-  <w:style w:customStyle="1" w:styleId="FirstParagraph" w:type="paragraph">
-    <w:name w:val="First Paragraph"/>
-    <w:basedOn w:val="BodyText"/>
-    <w:next w:val="BodyText"/>
-    <w:qFormat/>
-  </w:style>
-  <w:style w:customStyle="1" w:styleId="Compact" w:type="paragraph">
-    <w:name w:val="Compact"/>
-    <w:basedOn w:val="BodyText"/>
-    <w:qFormat/>
-    <w:pPr>
-      <w:spacing w:after="36" w:before="36"/>
-    </w:pPr>
-  </w:style>
-  <w:style w:styleId="Title" w:type="paragraph">
-    <w:name w:val="Title"/>
-    <w:basedOn w:val="Normal"/>
-    <w:next w:val="BodyText"/>
-    <w:link w:val="TitleChar"/>
-    <w:uiPriority w:val="10"/>
-    <w:qFormat/>
-    <w:rsid w:val="00A10FD9"/>
-    <w:pPr>
-      <w:spacing w:after="80" w:line="240" w:lineRule="auto"/>
-      <w:contextualSpacing/>
-      <w:jc w:val="center"/>
-    </w:pPr>
-    <w:rPr>
-      <w:rFonts w:asciiTheme="majorHAnsi" w:cstheme="majorBidi" w:eastAsiaTheme="majorEastAsia" w:hAnsiTheme="majorHAnsi"/>
-      <w:sz w:val="56"/>
-      <w:szCs w:val="56"/>
-    </w:rPr>
-  </w:style>
-  <w:style w:customStyle="1" w:styleId="TitleChar" w:type="character">
-    <w:name w:val="Title Char"/>
-    <w:basedOn w:val="DefaultParagraphFont"/>
-    <w:link w:val="Title"/>
-    <w:uiPriority w:val="10"/>
-    <w:rsid w:val="00A10FD9"/>
-    <w:rPr>
-      <w:rFonts w:asciiTheme="majorHAnsi" w:cstheme="majorBidi" w:eastAsiaTheme="majorEastAsia" w:hAnsiTheme="majorHAnsi"/>
-      <w:sz w:val="56"/>
-      <w:szCs w:val="56"/>
-    </w:rPr>
-  </w:style>
-  <w:style w:styleId="Subtitle" w:type="paragraph">
-    <w:name w:val="Subtitle"/>
-    <w:basedOn w:val="Title"/>
-    <w:next w:val="BodyText"/>
-    <w:link w:val="SubtitleChar"/>
-    <w:uiPriority w:val="11"/>
-    <w:qFormat/>
-    <w:rsid w:val="00A10FD9"/>
-    <w:pPr>
-      <w:numPr>
-        <w:ilvl w:val="1"/>
-      </w:numPr>
-    </w:pPr>
-    <w:rPr>
-      <w:rFonts w:cstheme="majorBidi" w:eastAsiaTheme="majorEastAsia"/>
-      <w:spacing w:val="15"/>
-      <w:sz w:val="28"/>
-      <w:szCs w:val="28"/>
-    </w:rPr>
-  </w:style>
-  <w:style w:customStyle="1" w:styleId="SubtitleChar" w:type="character">
-    <w:name w:val="Subtitle Char"/>
-    <w:basedOn w:val="DefaultParagraphFont"/>
-    <w:link w:val="Subtitle"/>
-    <w:uiPriority w:val="11"/>
-    <w:rsid w:val="00A10FD9"/>
-    <w:rPr>
-      <w:rFonts w:cstheme="majorBidi" w:eastAsiaTheme="majorEastAsia"/>
-      <w:color w:themeColor="text1" w:themeTint="A6" w:val="595959"/>
-      <w:spacing w:val="15"/>
-      <w:sz w:val="28"/>
-      <w:szCs w:val="28"/>
-    </w:rPr>
-  </w:style>
-  <w:style w:customStyle="1" w:styleId="Author" w:type="paragraph">
-    <w:name w:val="Author"/>
-    <w:basedOn w:val="Title"/>
-    <w:next w:val="BodyText"/>
-    <w:qFormat/>
-    <w:pPr>
-      <w:keepNext/>
-      <w:keepLines/>
-    </w:pPr>
-    <w:rPr>
-      <w:sz w:val="24"/>
-      <w:szCs w:val="24"/>
-    </w:rPr>
-  </w:style>
-  <w:style w:styleId="Date" w:type="paragraph">
-    <w:name w:val="Date"/>
-    <w:basedOn w:val="Title"/>
-    <w:next w:val="BodyText"/>
-    <w:qFormat/>
-    <w:pPr>
-      <w:keepNext/>
-      <w:keepLines/>
-    </w:pPr>
-    <w:rPr>
-      <w:sz w:val="24"/>
-      <w:szCs w:val="24"/>
-    </w:rPr>
-  </w:style>
-  <w:style w:customStyle="1" w:styleId="AbstractTitle" w:type="paragraph">
-    <w:name w:val="Abstract Title"/>
-    <w:basedOn w:val="Normal"/>
-    <w:next w:val="Abstract"/>
-    <w:qFormat/>
-    <w:pPr>
-      <w:keepNext/>
-      <w:keepLines/>
-      <w:spacing w:after="0" w:before="300"/>
-      <w:jc w:val="center"/>
-    </w:pPr>
-    <w:rPr>
-      <w:b/>
-      <w:sz w:val="20"/>
-      <w:szCs w:val="20"/>
-    </w:rPr>
-  </w:style>
-  <w:style w:customStyle="1" w:styleId="Abstract" w:type="paragraph">
-    <w:name w:val="Abstract"/>
-    <w:basedOn w:val="Normal"/>
-    <w:next w:val="BodyText"/>
-    <w:qFormat/>
-    <w:pPr>
-      <w:keepNext/>
-      <w:keepLines/>
-      <w:spacing w:after="300" w:before="100"/>
-    </w:pPr>
-    <w:rPr>
-      <w:sz w:val="20"/>
-      <w:szCs w:val="20"/>
-    </w:rPr>
-  </w:style>
-  <w:style w:styleId="Bibliography" w:type="paragraph">
-    <w:name w:val="Bibliography"/>
-    <w:basedOn w:val="Normal"/>
-    <w:next w:val="Bibliography"/>
-    <w:qFormat/>
-    <w:pPr/>
-    <w:rPr/>
-  </w:style>
-  <w:style w:styleId="Heading1" w:type="paragraph">
+  <w:style w:type="paragraph" w:styleId="Heading1">
     <w:name w:val="heading 1"/>
     <w:basedOn w:val="Normal"/>
     <w:next w:val="BodyText"/>
@@ -1952,17 +1971,17 @@
     <w:pPr>
       <w:keepNext/>
       <w:keepLines/>
-      <w:spacing w:after="80" w:before="360"/>
+      <w:spacing w:before="360" w:after="80"/>
       <w:outlineLvl w:val="0"/>
     </w:pPr>
     <w:rPr>
-      <w:rFonts w:asciiTheme="majorHAnsi" w:cstheme="majorBidi" w:eastAsiaTheme="majorEastAsia" w:hAnsiTheme="majorHAnsi"/>
-      <w:color w:themeColor="accent1" w:themeShade="BF" w:val="0F4761"/>
+      <w:rFonts w:asciiTheme="majorHAnsi" w:eastAsiaTheme="majorEastAsia" w:hAnsiTheme="majorHAnsi" w:cstheme="majorBidi"/>
+      <w:color w:val="0F4761" w:themeColor="accent1" w:themeShade="BF"/>
       <w:sz w:val="40"/>
       <w:szCs w:val="40"/>
     </w:rPr>
   </w:style>
-  <w:style w:styleId="Heading2" w:type="paragraph">
+  <w:style w:type="paragraph" w:styleId="Heading2">
     <w:name w:val="heading 2"/>
     <w:basedOn w:val="Normal"/>
     <w:next w:val="BodyText"/>
@@ -1975,17 +1994,17 @@
     <w:pPr>
       <w:keepNext/>
       <w:keepLines/>
-      <w:spacing w:after="80" w:before="160"/>
+      <w:spacing w:before="160" w:after="80"/>
       <w:outlineLvl w:val="1"/>
     </w:pPr>
     <w:rPr>
-      <w:rFonts w:asciiTheme="majorHAnsi" w:cstheme="majorBidi" w:eastAsiaTheme="majorEastAsia" w:hAnsiTheme="majorHAnsi"/>
-      <w:color w:themeColor="accent1" w:themeShade="BF" w:val="0F4761"/>
+      <w:rFonts w:asciiTheme="majorHAnsi" w:eastAsiaTheme="majorEastAsia" w:hAnsiTheme="majorHAnsi" w:cstheme="majorBidi"/>
+      <w:color w:val="0F4761" w:themeColor="accent1" w:themeShade="BF"/>
       <w:sz w:val="32"/>
       <w:szCs w:val="32"/>
     </w:rPr>
   </w:style>
-  <w:style w:styleId="Heading3" w:type="paragraph">
+  <w:style w:type="paragraph" w:styleId="Heading3">
     <w:name w:val="heading 3"/>
     <w:basedOn w:val="Normal"/>
     <w:next w:val="BodyText"/>
@@ -1998,17 +2017,17 @@
     <w:pPr>
       <w:keepNext/>
       <w:keepLines/>
-      <w:spacing w:after="80" w:before="160"/>
+      <w:spacing w:before="160" w:after="80"/>
       <w:outlineLvl w:val="2"/>
     </w:pPr>
     <w:rPr>
-      <w:rFonts w:cstheme="majorBidi" w:eastAsiaTheme="majorEastAsia"/>
-      <w:color w:themeColor="accent1" w:themeShade="BF" w:val="0F4761"/>
+      <w:rFonts w:eastAsiaTheme="majorEastAsia" w:cstheme="majorBidi"/>
+      <w:color w:val="0F4761" w:themeColor="accent1" w:themeShade="BF"/>
       <w:sz w:val="28"/>
       <w:szCs w:val="28"/>
     </w:rPr>
   </w:style>
-  <w:style w:styleId="Heading4" w:type="paragraph">
+  <w:style w:type="paragraph" w:styleId="Heading4">
     <w:name w:val="heading 4"/>
     <w:basedOn w:val="Normal"/>
     <w:next w:val="BodyText"/>
@@ -2021,17 +2040,17 @@
     <w:pPr>
       <w:keepNext/>
       <w:keepLines/>
-      <w:spacing w:after="40" w:before="80"/>
+      <w:spacing w:before="80" w:after="40"/>
       <w:outlineLvl w:val="3"/>
     </w:pPr>
     <w:rPr>
-      <w:rFonts w:cstheme="majorBidi" w:eastAsiaTheme="majorEastAsia"/>
+      <w:rFonts w:eastAsiaTheme="majorEastAsia" w:cstheme="majorBidi"/>
       <w:i/>
       <w:iCs/>
-      <w:color w:themeColor="accent1" w:themeShade="BF" w:val="0F4761"/>
-    </w:rPr>
-  </w:style>
-  <w:style w:styleId="Heading5" w:type="paragraph">
+      <w:color w:val="0F4761" w:themeColor="accent1" w:themeShade="BF"/>
+    </w:rPr>
+  </w:style>
+  <w:style w:type="paragraph" w:styleId="Heading5">
     <w:name w:val="heading 5"/>
     <w:basedOn w:val="Normal"/>
     <w:next w:val="BodyText"/>
@@ -2044,15 +2063,15 @@
     <w:pPr>
       <w:keepNext/>
       <w:keepLines/>
-      <w:spacing w:after="40" w:before="80"/>
+      <w:spacing w:before="80" w:after="40"/>
       <w:outlineLvl w:val="4"/>
     </w:pPr>
     <w:rPr>
-      <w:rFonts w:cstheme="majorBidi" w:eastAsiaTheme="majorEastAsia"/>
-      <w:color w:themeColor="accent1" w:themeShade="BF" w:val="0F4761"/>
-    </w:rPr>
-  </w:style>
-  <w:style w:styleId="Heading6" w:type="paragraph">
+      <w:rFonts w:eastAsiaTheme="majorEastAsia" w:cstheme="majorBidi"/>
+      <w:color w:val="0F4761" w:themeColor="accent1" w:themeShade="BF"/>
+    </w:rPr>
+  </w:style>
+  <w:style w:type="paragraph" w:styleId="Heading6">
     <w:name w:val="heading 6"/>
     <w:basedOn w:val="Normal"/>
     <w:next w:val="BodyText"/>
@@ -2065,17 +2084,17 @@
     <w:pPr>
       <w:keepNext/>
       <w:keepLines/>
-      <w:spacing w:after="0" w:before="40"/>
+      <w:spacing w:before="40" w:after="0"/>
       <w:outlineLvl w:val="5"/>
     </w:pPr>
     <w:rPr>
-      <w:rFonts w:cstheme="majorBidi" w:eastAsiaTheme="majorEastAsia"/>
+      <w:rFonts w:eastAsiaTheme="majorEastAsia" w:cstheme="majorBidi"/>
       <w:i/>
       <w:iCs/>
-      <w:color w:themeColor="text1" w:themeTint="A6" w:val="595959"/>
-    </w:rPr>
-  </w:style>
-  <w:style w:styleId="Heading7" w:type="paragraph">
+      <w:color w:val="595959" w:themeColor="text1" w:themeTint="A6"/>
+    </w:rPr>
+  </w:style>
+  <w:style w:type="paragraph" w:styleId="Heading7">
     <w:name w:val="heading 7"/>
     <w:basedOn w:val="Normal"/>
     <w:next w:val="BodyText"/>
@@ -2088,15 +2107,15 @@
     <w:pPr>
       <w:keepNext/>
       <w:keepLines/>
-      <w:spacing w:after="0" w:before="40"/>
+      <w:spacing w:before="40" w:after="0"/>
       <w:outlineLvl w:val="6"/>
     </w:pPr>
     <w:rPr>
-      <w:rFonts w:cstheme="majorBidi" w:eastAsiaTheme="majorEastAsia"/>
-      <w:color w:themeColor="text1" w:themeTint="A6" w:val="595959"/>
-    </w:rPr>
-  </w:style>
-  <w:style w:styleId="Heading8" w:type="paragraph">
+      <w:rFonts w:eastAsiaTheme="majorEastAsia" w:cstheme="majorBidi"/>
+      <w:color w:val="595959" w:themeColor="text1" w:themeTint="A6"/>
+    </w:rPr>
+  </w:style>
+  <w:style w:type="paragraph" w:styleId="Heading8">
     <w:name w:val="heading 8"/>
     <w:basedOn w:val="Normal"/>
     <w:next w:val="BodyText"/>
@@ -2113,13 +2132,13 @@
       <w:outlineLvl w:val="7"/>
     </w:pPr>
     <w:rPr>
-      <w:rFonts w:cstheme="majorBidi" w:eastAsiaTheme="majorEastAsia"/>
+      <w:rFonts w:eastAsiaTheme="majorEastAsia" w:cstheme="majorBidi"/>
       <w:i/>
       <w:iCs/>
-      <w:color w:themeColor="text1" w:themeTint="D8" w:val="272727"/>
-    </w:rPr>
-  </w:style>
-  <w:style w:styleId="Heading9" w:type="paragraph">
+      <w:color w:val="272727" w:themeColor="text1" w:themeTint="D8"/>
+    </w:rPr>
+  </w:style>
+  <w:style w:type="paragraph" w:styleId="Heading9">
     <w:name w:val="heading 9"/>
     <w:basedOn w:val="Normal"/>
     <w:next w:val="BodyText"/>
@@ -2136,24 +2155,202 @@
       <w:outlineLvl w:val="8"/>
     </w:pPr>
     <w:rPr>
-      <w:rFonts w:cstheme="majorBidi" w:eastAsiaTheme="majorEastAsia"/>
-      <w:color w:themeColor="text1" w:themeTint="D8" w:val="272727"/>
-    </w:rPr>
-  </w:style>
-  <w:style w:customStyle="1" w:styleId="Heading1Char" w:type="character">
+      <w:rFonts w:eastAsiaTheme="majorEastAsia" w:cstheme="majorBidi"/>
+      <w:color w:val="272727" w:themeColor="text1" w:themeTint="D8"/>
+    </w:rPr>
+  </w:style>
+  <w:style w:type="character" w:default="1" w:styleId="DefaultParagraphFont">
+    <w:name w:val="Default Paragraph Font"/>
+    <w:uiPriority w:val="1"/>
+    <w:semiHidden/>
+    <w:unhideWhenUsed/>
+  </w:style>
+  <w:style w:type="table" w:default="1" w:styleId="TableNormal">
+    <w:name w:val="Normal Table"/>
+    <w:uiPriority w:val="99"/>
+    <w:semiHidden/>
+    <w:unhideWhenUsed/>
+    <w:tblPr>
+      <w:tblInd w:w="0" w:type="dxa"/>
+      <w:tblCellMar>
+        <w:top w:w="0" w:type="dxa"/>
+        <w:left w:w="108" w:type="dxa"/>
+        <w:bottom w:w="0" w:type="dxa"/>
+        <w:right w:w="108" w:type="dxa"/>
+      </w:tblCellMar>
+    </w:tblPr>
+  </w:style>
+  <w:style w:type="numbering" w:default="1" w:styleId="NoList">
+    <w:name w:val="No List"/>
+    <w:uiPriority w:val="99"/>
+    <w:semiHidden/>
+    <w:unhideWhenUsed/>
+  </w:style>
+  <w:style w:type="paragraph" w:styleId="BodyText">
+    <w:name w:val="Body Text"/>
+    <w:basedOn w:val="Normal"/>
+    <w:qFormat/>
+    <w:pPr>
+      <w:spacing w:before="180" w:after="180"/>
+    </w:pPr>
+  </w:style>
+  <w:style w:type="paragraph" w:customStyle="1" w:styleId="FirstParagraph">
+    <w:name w:val="First Paragraph"/>
+    <w:basedOn w:val="BodyText"/>
+    <w:next w:val="BodyText"/>
+    <w:qFormat/>
+  </w:style>
+  <w:style w:type="paragraph" w:customStyle="1" w:styleId="Compact">
+    <w:name w:val="Compact"/>
+    <w:basedOn w:val="BodyText"/>
+    <w:qFormat/>
+    <w:pPr>
+      <w:spacing w:before="36" w:after="36"/>
+    </w:pPr>
+  </w:style>
+  <w:style w:type="paragraph" w:styleId="Title">
+    <w:name w:val="Title"/>
+    <w:basedOn w:val="Normal"/>
+    <w:next w:val="BodyText"/>
+    <w:link w:val="TitleChar"/>
+    <w:uiPriority w:val="10"/>
+    <w:qFormat/>
+    <w:rsid w:val="00A10FD9"/>
+    <w:pPr>
+      <w:spacing w:after="80"/>
+      <w:contextualSpacing/>
+      <w:jc w:val="center"/>
+    </w:pPr>
+    <w:rPr>
+      <w:rFonts w:asciiTheme="majorHAnsi" w:eastAsiaTheme="majorEastAsia" w:hAnsiTheme="majorHAnsi" w:cstheme="majorBidi"/>
+      <w:sz w:val="56"/>
+      <w:szCs w:val="56"/>
+    </w:rPr>
+  </w:style>
+  <w:style w:type="character" w:customStyle="1" w:styleId="TitleChar">
+    <w:name w:val="Title Char"/>
+    <w:basedOn w:val="DefaultParagraphFont"/>
+    <w:link w:val="Title"/>
+    <w:uiPriority w:val="10"/>
+    <w:rsid w:val="00A10FD9"/>
+    <w:rPr>
+      <w:rFonts w:asciiTheme="majorHAnsi" w:eastAsiaTheme="majorEastAsia" w:hAnsiTheme="majorHAnsi" w:cstheme="majorBidi"/>
+      <w:sz w:val="56"/>
+      <w:szCs w:val="56"/>
+    </w:rPr>
+  </w:style>
+  <w:style w:type="paragraph" w:styleId="Subtitle">
+    <w:name w:val="Subtitle"/>
+    <w:basedOn w:val="Title"/>
+    <w:next w:val="BodyText"/>
+    <w:link w:val="SubtitleChar"/>
+    <w:uiPriority w:val="11"/>
+    <w:qFormat/>
+    <w:rsid w:val="00A10FD9"/>
+    <w:pPr>
+      <w:numPr>
+        <w:ilvl w:val="1"/>
+      </w:numPr>
+    </w:pPr>
+    <w:rPr>
+      <w:spacing w:val="15"/>
+      <w:sz w:val="28"/>
+      <w:szCs w:val="28"/>
+    </w:rPr>
+  </w:style>
+  <w:style w:type="character" w:customStyle="1" w:styleId="SubtitleChar">
+    <w:name w:val="Subtitle Char"/>
+    <w:basedOn w:val="DefaultParagraphFont"/>
+    <w:link w:val="Subtitle"/>
+    <w:uiPriority w:val="11"/>
+    <w:rsid w:val="00A10FD9"/>
+    <w:rPr>
+      <w:rFonts w:eastAsiaTheme="majorEastAsia" w:cstheme="majorBidi"/>
+      <w:color w:val="595959" w:themeColor="text1" w:themeTint="A6"/>
+      <w:spacing w:val="15"/>
+      <w:sz w:val="28"/>
+      <w:szCs w:val="28"/>
+    </w:rPr>
+  </w:style>
+  <w:style w:type="paragraph" w:customStyle="1" w:styleId="Author">
+    <w:name w:val="Author"/>
+    <w:basedOn w:val="Title"/>
+    <w:next w:val="BodyText"/>
+    <w:qFormat/>
+    <w:pPr>
+      <w:keepNext/>
+      <w:keepLines/>
+    </w:pPr>
+    <w:rPr>
+      <w:sz w:val="24"/>
+      <w:szCs w:val="24"/>
+    </w:rPr>
+  </w:style>
+  <w:style w:type="paragraph" w:styleId="Date">
+    <w:name w:val="Date"/>
+    <w:basedOn w:val="Title"/>
+    <w:next w:val="BodyText"/>
+    <w:qFormat/>
+    <w:pPr>
+      <w:keepNext/>
+      <w:keepLines/>
+    </w:pPr>
+    <w:rPr>
+      <w:sz w:val="24"/>
+      <w:szCs w:val="24"/>
+    </w:rPr>
+  </w:style>
+  <w:style w:type="paragraph" w:customStyle="1" w:styleId="AbstractTitle">
+    <w:name w:val="Abstract Title"/>
+    <w:basedOn w:val="Normal"/>
+    <w:next w:val="Abstract"/>
+    <w:qFormat/>
+    <w:pPr>
+      <w:keepNext/>
+      <w:keepLines/>
+      <w:spacing w:before="300" w:after="0"/>
+      <w:jc w:val="center"/>
+    </w:pPr>
+    <w:rPr>
+      <w:b/>
+      <w:sz w:val="20"/>
+      <w:szCs w:val="20"/>
+    </w:rPr>
+  </w:style>
+  <w:style w:type="paragraph" w:customStyle="1" w:styleId="Abstract">
+    <w:name w:val="Abstract"/>
+    <w:basedOn w:val="Normal"/>
+    <w:next w:val="BodyText"/>
+    <w:qFormat/>
+    <w:pPr>
+      <w:keepNext/>
+      <w:keepLines/>
+      <w:spacing w:before="100" w:after="300"/>
+    </w:pPr>
+    <w:rPr>
+      <w:sz w:val="20"/>
+      <w:szCs w:val="20"/>
+    </w:rPr>
+  </w:style>
+  <w:style w:type="paragraph" w:styleId="Bibliography">
+    <w:name w:val="Bibliography"/>
+    <w:basedOn w:val="Normal"/>
+    <w:qFormat/>
+  </w:style>
+  <w:style w:type="character" w:customStyle="1" w:styleId="Heading1Char">
     <w:name w:val="Heading 1 Char"/>
     <w:basedOn w:val="DefaultParagraphFont"/>
     <w:link w:val="Heading1"/>
     <w:uiPriority w:val="9"/>
     <w:rsid w:val="00A10FD9"/>
     <w:rPr>
-      <w:rFonts w:asciiTheme="majorHAnsi" w:cstheme="majorBidi" w:eastAsiaTheme="majorEastAsia" w:hAnsiTheme="majorHAnsi"/>
-      <w:color w:themeColor="accent1" w:themeShade="BF" w:val="0F4761"/>
+      <w:rFonts w:asciiTheme="majorHAnsi" w:eastAsiaTheme="majorEastAsia" w:hAnsiTheme="majorHAnsi" w:cstheme="majorBidi"/>
+      <w:color w:val="0F4761" w:themeColor="accent1" w:themeShade="BF"/>
       <w:sz w:val="40"/>
       <w:szCs w:val="40"/>
     </w:rPr>
   </w:style>
-  <w:style w:customStyle="1" w:styleId="Heading2Char" w:type="character">
+  <w:style w:type="character" w:customStyle="1" w:styleId="Heading2Char">
     <w:name w:val="Heading 2 Char"/>
     <w:basedOn w:val="DefaultParagraphFont"/>
     <w:link w:val="Heading2"/>
@@ -2161,13 +2358,13 @@
     <w:semiHidden/>
     <w:rsid w:val="00A10FD9"/>
     <w:rPr>
-      <w:rFonts w:asciiTheme="majorHAnsi" w:cstheme="majorBidi" w:eastAsiaTheme="majorEastAsia" w:hAnsiTheme="majorHAnsi"/>
-      <w:color w:themeColor="accent1" w:themeShade="BF" w:val="0F4761"/>
+      <w:rFonts w:asciiTheme="majorHAnsi" w:eastAsiaTheme="majorEastAsia" w:hAnsiTheme="majorHAnsi" w:cstheme="majorBidi"/>
+      <w:color w:val="0F4761" w:themeColor="accent1" w:themeShade="BF"/>
       <w:sz w:val="32"/>
       <w:szCs w:val="32"/>
     </w:rPr>
   </w:style>
-  <w:style w:customStyle="1" w:styleId="Heading3Char" w:type="character">
+  <w:style w:type="character" w:customStyle="1" w:styleId="Heading3Char">
     <w:name w:val="Heading 3 Char"/>
     <w:basedOn w:val="DefaultParagraphFont"/>
     <w:link w:val="Heading3"/>
@@ -2175,13 +2372,13 @@
     <w:semiHidden/>
     <w:rsid w:val="00A10FD9"/>
     <w:rPr>
-      <w:rFonts w:cstheme="majorBidi" w:eastAsiaTheme="majorEastAsia"/>
-      <w:color w:themeColor="accent1" w:themeShade="BF" w:val="0F4761"/>
+      <w:rFonts w:eastAsiaTheme="majorEastAsia" w:cstheme="majorBidi"/>
+      <w:color w:val="0F4761" w:themeColor="accent1" w:themeShade="BF"/>
       <w:sz w:val="28"/>
       <w:szCs w:val="28"/>
     </w:rPr>
   </w:style>
-  <w:style w:customStyle="1" w:styleId="Heading4Char" w:type="character">
+  <w:style w:type="character" w:customStyle="1" w:styleId="Heading4Char">
     <w:name w:val="Heading 4 Char"/>
     <w:basedOn w:val="DefaultParagraphFont"/>
     <w:link w:val="Heading4"/>
@@ -2189,13 +2386,13 @@
     <w:semiHidden/>
     <w:rsid w:val="00A10FD9"/>
     <w:rPr>
-      <w:rFonts w:cstheme="majorBidi" w:eastAsiaTheme="majorEastAsia"/>
+      <w:rFonts w:eastAsiaTheme="majorEastAsia" w:cstheme="majorBidi"/>
       <w:i/>
       <w:iCs/>
-      <w:color w:themeColor="accent1" w:themeShade="BF" w:val="0F4761"/>
-    </w:rPr>
-  </w:style>
-  <w:style w:customStyle="1" w:styleId="Heading5Char" w:type="character">
+      <w:color w:val="0F4761" w:themeColor="accent1" w:themeShade="BF"/>
+    </w:rPr>
+  </w:style>
+  <w:style w:type="character" w:customStyle="1" w:styleId="Heading5Char">
     <w:name w:val="Heading 5 Char"/>
     <w:basedOn w:val="DefaultParagraphFont"/>
     <w:link w:val="Heading5"/>
@@ -2203,11 +2400,11 @@
     <w:semiHidden/>
     <w:rsid w:val="00A10FD9"/>
     <w:rPr>
-      <w:rFonts w:cstheme="majorBidi" w:eastAsiaTheme="majorEastAsia"/>
-      <w:color w:themeColor="accent1" w:themeShade="BF" w:val="0F4761"/>
-    </w:rPr>
-  </w:style>
-  <w:style w:customStyle="1" w:styleId="Heading6Char" w:type="character">
+      <w:rFonts w:eastAsiaTheme="majorEastAsia" w:cstheme="majorBidi"/>
+      <w:color w:val="0F4761" w:themeColor="accent1" w:themeShade="BF"/>
+    </w:rPr>
+  </w:style>
+  <w:style w:type="character" w:customStyle="1" w:styleId="Heading6Char">
     <w:name w:val="Heading 6 Char"/>
     <w:basedOn w:val="DefaultParagraphFont"/>
     <w:link w:val="Heading6"/>
@@ -2215,13 +2412,13 @@
     <w:semiHidden/>
     <w:rsid w:val="00A10FD9"/>
     <w:rPr>
-      <w:rFonts w:cstheme="majorBidi" w:eastAsiaTheme="majorEastAsia"/>
+      <w:rFonts w:eastAsiaTheme="majorEastAsia" w:cstheme="majorBidi"/>
       <w:i/>
       <w:iCs/>
-      <w:color w:themeColor="text1" w:themeTint="A6" w:val="595959"/>
-    </w:rPr>
-  </w:style>
-  <w:style w:customStyle="1" w:styleId="Heading7Char" w:type="character">
+      <w:color w:val="595959" w:themeColor="text1" w:themeTint="A6"/>
+    </w:rPr>
+  </w:style>
+  <w:style w:type="character" w:customStyle="1" w:styleId="Heading7Char">
     <w:name w:val="Heading 7 Char"/>
     <w:basedOn w:val="DefaultParagraphFont"/>
     <w:link w:val="Heading7"/>
@@ -2229,11 +2426,11 @@
     <w:semiHidden/>
     <w:rsid w:val="00A10FD9"/>
     <w:rPr>
-      <w:rFonts w:cstheme="majorBidi" w:eastAsiaTheme="majorEastAsia"/>
-      <w:color w:themeColor="text1" w:themeTint="A6" w:val="595959"/>
-    </w:rPr>
-  </w:style>
-  <w:style w:customStyle="1" w:styleId="Heading8Char" w:type="character">
+      <w:rFonts w:eastAsiaTheme="majorEastAsia" w:cstheme="majorBidi"/>
+      <w:color w:val="595959" w:themeColor="text1" w:themeTint="A6"/>
+    </w:rPr>
+  </w:style>
+  <w:style w:type="character" w:customStyle="1" w:styleId="Heading8Char">
     <w:name w:val="Heading 8 Char"/>
     <w:basedOn w:val="DefaultParagraphFont"/>
     <w:link w:val="Heading8"/>
@@ -2241,13 +2438,13 @@
     <w:semiHidden/>
     <w:rsid w:val="00A10FD9"/>
     <w:rPr>
-      <w:rFonts w:cstheme="majorBidi" w:eastAsiaTheme="majorEastAsia"/>
+      <w:rFonts w:eastAsiaTheme="majorEastAsia" w:cstheme="majorBidi"/>
       <w:i/>
       <w:iCs/>
-      <w:color w:themeColor="text1" w:themeTint="D8" w:val="272727"/>
-    </w:rPr>
-  </w:style>
-  <w:style w:customStyle="1" w:styleId="Heading9Char" w:type="character">
+      <w:color w:val="272727" w:themeColor="text1" w:themeTint="D8"/>
+    </w:rPr>
+  </w:style>
+  <w:style w:type="character" w:customStyle="1" w:styleId="Heading9Char">
     <w:name w:val="Heading 9 Char"/>
     <w:basedOn w:val="DefaultParagraphFont"/>
     <w:link w:val="Heading9"/>
@@ -2255,11 +2452,11 @@
     <w:semiHidden/>
     <w:rsid w:val="00A10FD9"/>
     <w:rPr>
-      <w:rFonts w:cstheme="majorBidi" w:eastAsiaTheme="majorEastAsia"/>
-      <w:color w:themeColor="text1" w:themeTint="D8" w:val="272727"/>
-    </w:rPr>
-  </w:style>
-  <w:style w:styleId="BlockText" w:type="paragraph">
+      <w:rFonts w:eastAsiaTheme="majorEastAsia" w:cstheme="majorBidi"/>
+      <w:color w:val="272727" w:themeColor="text1" w:themeTint="D8"/>
+    </w:rPr>
+  </w:style>
+  <w:style w:type="paragraph" w:styleId="BlockText">
     <w:name w:val="Block Text"/>
     <w:basedOn w:val="BodyText"/>
     <w:next w:val="BodyText"/>
@@ -2267,19 +2464,18 @@
     <w:unhideWhenUsed/>
     <w:qFormat/>
     <w:pPr>
-      <w:spacing w:after="100" w:before="100"/>
-      <w:ind w:firstLine="0" w:left="480" w:right="480"/>
+      <w:spacing w:before="100" w:after="100"/>
+      <w:ind w:left="480" w:right="480"/>
     </w:pPr>
   </w:style>
-  <w:style w:styleId="FootnoteText" w:type="paragraph">
-    <w:name w:val="Footnote Text"/>
+  <w:style w:type="paragraph" w:styleId="FootnoteText">
+    <w:name w:val="footnote text"/>
     <w:basedOn w:val="Normal"/>
-    <w:next w:val="FootnoteText"/>
     <w:uiPriority w:val="9"/>
     <w:unhideWhenUsed/>
     <w:qFormat/>
   </w:style>
-  <w:style w:styleId="FootnoteBlockText" w:type="paragraph">
+  <w:style w:type="paragraph" w:customStyle="1" w:styleId="FootnoteBlockText">
     <w:name w:val="Footnote Block Text"/>
     <w:basedOn w:val="FootnoteText"/>
     <w:next w:val="FootnoteText"/>
@@ -2287,40 +2483,35 @@
     <w:unhideWhenUsed/>
     <w:qFormat/>
     <w:pPr>
-      <w:spacing w:after="100" w:before="100"/>
-      <w:ind w:firstLine="0" w:left="480" w:right="480"/>
+      <w:spacing w:before="100" w:after="100"/>
+      <w:ind w:left="480" w:right="480"/>
     </w:pPr>
   </w:style>
-  <w:style w:default="1" w:styleId="DefaultParagraphFont" w:type="character">
-    <w:name w:val="Default Paragraph Font"/>
-    <w:semiHidden/>
-    <w:unhideWhenUsed/>
-  </w:style>
-  <w:style w:default="1" w:styleId="Table" w:type="table">
+  <w:style w:type="table" w:customStyle="1" w:styleId="Table">
     <w:name w:val="Table"/>
-    <w:basedOn w:val="TableNormal"/>
     <w:semiHidden/>
     <w:unhideWhenUsed/>
     <w:qFormat/>
     <w:tblPr>
-      <w:tblInd w:type="dxa" w:w="0"/>
+      <w:tblInd w:w="0" w:type="dxa"/>
       <w:tblCellMar>
-        <w:top w:type="dxa" w:w="0"/>
-        <w:left w:type="dxa" w:w="108"/>
-        <w:bottom w:type="dxa" w:w="0"/>
-        <w:right w:type="dxa" w:w="108"/>
+        <w:top w:w="0" w:type="dxa"/>
+        <w:left w:w="108" w:type="dxa"/>
+        <w:bottom w:w="0" w:type="dxa"/>
+        <w:right w:w="108" w:type="dxa"/>
       </w:tblCellMar>
     </w:tblPr>
     <w:tblStylePr w:type="firstRow">
+      <w:tblPr/>
       <w:tcPr>
         <w:tcBorders>
-          <w:bottom w:val="single"/>
+          <w:bottom w:val="single" w:sz="0" w:space="0" w:color="auto"/>
         </w:tcBorders>
         <w:vAlign w:val="bottom"/>
       </w:tcPr>
     </w:tblStylePr>
   </w:style>
-  <w:style w:customStyle="1" w:styleId="DefinitionTerm" w:type="paragraph">
+  <w:style w:type="paragraph" w:customStyle="1" w:styleId="DefinitionTerm">
     <w:name w:val="Definition Term"/>
     <w:basedOn w:val="Normal"/>
     <w:next w:val="Definition"/>
@@ -2333,75 +2524,76 @@
       <w:b/>
     </w:rPr>
   </w:style>
-  <w:style w:customStyle="1" w:styleId="Definition" w:type="paragraph">
+  <w:style w:type="paragraph" w:customStyle="1" w:styleId="Definition">
     <w:name w:val="Definition"/>
     <w:basedOn w:val="Normal"/>
   </w:style>
-  <w:style w:styleId="Caption" w:type="paragraph">
-    <w:name w:val="Caption"/>
+  <w:style w:type="paragraph" w:styleId="Caption">
+    <w:name w:val="caption"/>
     <w:basedOn w:val="Normal"/>
-    <w:link w:val="BodyTextChar"/>
+    <w:link w:val="CaptionChar"/>
     <w:pPr>
-      <w:spacing w:after="120" w:before="0"/>
+      <w:spacing w:after="120"/>
     </w:pPr>
     <w:rPr>
       <w:i/>
     </w:rPr>
   </w:style>
-  <w:style w:customStyle="1" w:styleId="TableCaption" w:type="paragraph">
+  <w:style w:type="paragraph" w:customStyle="1" w:styleId="TableCaption">
     <w:name w:val="Table Caption"/>
     <w:basedOn w:val="Caption"/>
     <w:pPr>
       <w:keepNext/>
     </w:pPr>
   </w:style>
-  <w:style w:customStyle="1" w:styleId="ImageCaption" w:type="paragraph">
+  <w:style w:type="paragraph" w:customStyle="1" w:styleId="ImageCaption">
     <w:name w:val="Image Caption"/>
     <w:basedOn w:val="Caption"/>
   </w:style>
-  <w:style w:customStyle="1" w:styleId="Figure" w:type="paragraph">
+  <w:style w:type="paragraph" w:customStyle="1" w:styleId="Figure">
     <w:name w:val="Figure"/>
     <w:basedOn w:val="Normal"/>
   </w:style>
-  <w:style w:customStyle="1" w:styleId="CaptionedFigure" w:type="paragraph">
+  <w:style w:type="paragraph" w:customStyle="1" w:styleId="CaptionedFigure">
     <w:name w:val="Captioned Figure"/>
     <w:basedOn w:val="Figure"/>
     <w:pPr>
       <w:keepNext/>
     </w:pPr>
   </w:style>
-  <w:style w:customStyle="1" w:styleId="BodyTextChar" w:type="character">
-    <w:name w:val="Body Text Char"/>
+  <w:style w:type="character" w:customStyle="1" w:styleId="CaptionChar">
+    <w:name w:val="Caption Char"/>
     <w:basedOn w:val="DefaultParagraphFont"/>
-    <w:link w:val="BodyText"/>
-  </w:style>
-  <w:style w:customStyle="1" w:styleId="VerbatimChar" w:type="character">
+    <w:link w:val="Caption"/>
+  </w:style>
+  <w:style w:type="character" w:customStyle="1" w:styleId="VerbatimChar">
     <w:name w:val="Verbatim Char"/>
-    <w:basedOn w:val="BodyTextChar"/>
+    <w:basedOn w:val="CaptionChar"/>
+    <w:link w:val="SourceCode"/>
     <w:rPr>
       <w:rFonts w:ascii="Consolas" w:hAnsi="Consolas"/>
       <w:sz w:val="22"/>
     </w:rPr>
   </w:style>
-  <w:style w:customStyle="1" w:styleId="SectionNumber" w:type="character">
+  <w:style w:type="character" w:customStyle="1" w:styleId="SectionNumber">
     <w:name w:val="Section Number"/>
-    <w:basedOn w:val="BodyTextChar"/>
-  </w:style>
-  <w:style w:styleId="FootnoteReference" w:type="character">
-    <w:name w:val="Footnote Reference"/>
-    <w:basedOn w:val="BodyTextChar"/>
+    <w:basedOn w:val="CaptionChar"/>
+  </w:style>
+  <w:style w:type="character" w:styleId="FootnoteReference">
+    <w:name w:val="footnote reference"/>
+    <w:basedOn w:val="CaptionChar"/>
     <w:rPr>
       <w:vertAlign w:val="superscript"/>
     </w:rPr>
   </w:style>
-  <w:style w:styleId="Hyperlink" w:type="character">
+  <w:style w:type="character" w:styleId="Hyperlink">
     <w:name w:val="Hyperlink"/>
-    <w:basedOn w:val="BodyTextChar"/>
-    <w:rPr>
-      <w:color w:themeColor="accent1" w:val="4F81BD"/>
-    </w:rPr>
-  </w:style>
-  <w:style w:styleId="TOCHeading" w:type="paragraph">
+    <w:basedOn w:val="CaptionChar"/>
+    <w:rPr>
+      <w:color w:val="156082" w:themeColor="accent1"/>
+    </w:rPr>
+  </w:style>
+  <w:style w:type="paragraph" w:styleId="TOCHeading">
     <w:name w:val="TOC Heading"/>
     <w:basedOn w:val="Heading1"/>
     <w:next w:val="BodyText"/>
@@ -2412,246 +2604,305 @@
       <w:spacing w:before="240" w:line="259" w:lineRule="auto"/>
       <w:outlineLvl w:val="9"/>
     </w:pPr>
-    <w:rPr>
-      <w:rFonts w:asciiTheme="majorHAnsi" w:cstheme="majorBidi" w:eastAsiaTheme="majorEastAsia" w:hAnsiTheme="majorHAnsi"/>
-      <w:b w:val="0"/>
-      <w:bCs w:val="0"/>
-      <w:color w:themeColor="accent1" w:themeShade="BF" w:val="365F91"/>
-    </w:rPr>
   </w:style>
   <w:style w:type="paragraph" w:customStyle="1" w:styleId="SourceCode">
     <w:name w:val="Source Code"/>
     <w:basedOn w:val="Normal"/>
     <w:link w:val="VerbatimChar"/>
     <w:pPr>
-      <w:wordWrap w:val="off"/>
+      <w:wordWrap w:val="0"/>
     </w:pPr>
   </w:style>
   <w:style w:type="character" w:customStyle="1" w:styleId="KeywordTok">
     <w:name w:val="KeywordTok"/>
     <w:basedOn w:val="VerbatimChar"/>
     <w:rPr>
+      <w:rFonts w:ascii="Consolas" w:hAnsi="Consolas"/>
       <w:b/>
       <w:color w:val="007020"/>
+      <w:sz w:val="22"/>
     </w:rPr>
   </w:style>
   <w:style w:type="character" w:customStyle="1" w:styleId="DataTypeTok">
     <w:name w:val="DataTypeTok"/>
     <w:basedOn w:val="VerbatimChar"/>
     <w:rPr>
+      <w:rFonts w:ascii="Consolas" w:hAnsi="Consolas"/>
       <w:color w:val="902000"/>
+      <w:sz w:val="22"/>
     </w:rPr>
   </w:style>
   <w:style w:type="character" w:customStyle="1" w:styleId="DecValTok">
     <w:name w:val="DecValTok"/>
     <w:basedOn w:val="VerbatimChar"/>
     <w:rPr>
-      <w:color w:val="40a070"/>
+      <w:rFonts w:ascii="Consolas" w:hAnsi="Consolas"/>
+      <w:color w:val="40A070"/>
+      <w:sz w:val="22"/>
     </w:rPr>
   </w:style>
   <w:style w:type="character" w:customStyle="1" w:styleId="BaseNTok">
     <w:name w:val="BaseNTok"/>
     <w:basedOn w:val="VerbatimChar"/>
     <w:rPr>
-      <w:color w:val="40a070"/>
+      <w:rFonts w:ascii="Consolas" w:hAnsi="Consolas"/>
+      <w:color w:val="40A070"/>
+      <w:sz w:val="22"/>
     </w:rPr>
   </w:style>
   <w:style w:type="character" w:customStyle="1" w:styleId="FloatTok">
     <w:name w:val="FloatTok"/>
     <w:basedOn w:val="VerbatimChar"/>
     <w:rPr>
-      <w:color w:val="40a070"/>
+      <w:rFonts w:ascii="Consolas" w:hAnsi="Consolas"/>
+      <w:color w:val="40A070"/>
+      <w:sz w:val="22"/>
     </w:rPr>
   </w:style>
   <w:style w:type="character" w:customStyle="1" w:styleId="ConstantTok">
     <w:name w:val="ConstantTok"/>
     <w:basedOn w:val="VerbatimChar"/>
     <w:rPr>
+      <w:rFonts w:ascii="Consolas" w:hAnsi="Consolas"/>
       <w:color w:val="880000"/>
+      <w:sz w:val="22"/>
     </w:rPr>
   </w:style>
   <w:style w:type="character" w:customStyle="1" w:styleId="CharTok">
     <w:name w:val="CharTok"/>
     <w:basedOn w:val="VerbatimChar"/>
     <w:rPr>
-      <w:color w:val="4070a0"/>
+      <w:rFonts w:ascii="Consolas" w:hAnsi="Consolas"/>
+      <w:color w:val="4070A0"/>
+      <w:sz w:val="22"/>
     </w:rPr>
   </w:style>
   <w:style w:type="character" w:customStyle="1" w:styleId="SpecialCharTok">
     <w:name w:val="SpecialCharTok"/>
     <w:basedOn w:val="VerbatimChar"/>
     <w:rPr>
-      <w:color w:val="4070a0"/>
+      <w:rFonts w:ascii="Consolas" w:hAnsi="Consolas"/>
+      <w:color w:val="4070A0"/>
+      <w:sz w:val="22"/>
     </w:rPr>
   </w:style>
   <w:style w:type="character" w:customStyle="1" w:styleId="StringTok">
     <w:name w:val="StringTok"/>
     <w:basedOn w:val="VerbatimChar"/>
     <w:rPr>
-      <w:color w:val="4070a0"/>
+      <w:rFonts w:ascii="Consolas" w:hAnsi="Consolas"/>
+      <w:color w:val="4070A0"/>
+      <w:sz w:val="22"/>
     </w:rPr>
   </w:style>
   <w:style w:type="character" w:customStyle="1" w:styleId="VerbatimStringTok">
     <w:name w:val="VerbatimStringTok"/>
     <w:basedOn w:val="VerbatimChar"/>
     <w:rPr>
-      <w:color w:val="4070a0"/>
+      <w:rFonts w:ascii="Consolas" w:hAnsi="Consolas"/>
+      <w:color w:val="4070A0"/>
+      <w:sz w:val="22"/>
     </w:rPr>
   </w:style>
   <w:style w:type="character" w:customStyle="1" w:styleId="SpecialStringTok">
     <w:name w:val="SpecialStringTok"/>
     <w:basedOn w:val="VerbatimChar"/>
     <w:rPr>
-      <w:color w:val="bb6688"/>
+      <w:rFonts w:ascii="Consolas" w:hAnsi="Consolas"/>
+      <w:color w:val="BB6688"/>
+      <w:sz w:val="22"/>
     </w:rPr>
   </w:style>
   <w:style w:type="character" w:customStyle="1" w:styleId="ImportTok">
     <w:name w:val="ImportTok"/>
     <w:basedOn w:val="VerbatimChar"/>
     <w:rPr>
+      <w:rFonts w:ascii="Consolas" w:hAnsi="Consolas"/>
       <w:b/>
       <w:color w:val="008000"/>
+      <w:sz w:val="22"/>
     </w:rPr>
   </w:style>
   <w:style w:type="character" w:customStyle="1" w:styleId="CommentTok">
     <w:name w:val="CommentTok"/>
     <w:basedOn w:val="VerbatimChar"/>
     <w:rPr>
+      <w:rFonts w:ascii="Consolas" w:hAnsi="Consolas"/>
       <w:i/>
-      <w:color w:val="60a0b0"/>
+      <w:color w:val="60A0B0"/>
+      <w:sz w:val="22"/>
     </w:rPr>
   </w:style>
   <w:style w:type="character" w:customStyle="1" w:styleId="DocumentationTok">
     <w:name w:val="DocumentationTok"/>
     <w:basedOn w:val="VerbatimChar"/>
     <w:rPr>
+      <w:rFonts w:ascii="Consolas" w:hAnsi="Consolas"/>
       <w:i/>
-      <w:color w:val="ba2121"/>
+      <w:color w:val="BA2121"/>
+      <w:sz w:val="22"/>
     </w:rPr>
   </w:style>
   <w:style w:type="character" w:customStyle="1" w:styleId="AnnotationTok">
     <w:name w:val="AnnotationTok"/>
     <w:basedOn w:val="VerbatimChar"/>
     <w:rPr>
+      <w:rFonts w:ascii="Consolas" w:hAnsi="Consolas"/>
       <w:b/>
       <w:i/>
-      <w:color w:val="60a0b0"/>
+      <w:color w:val="60A0B0"/>
+      <w:sz w:val="22"/>
     </w:rPr>
   </w:style>
   <w:style w:type="character" w:customStyle="1" w:styleId="CommentVarTok">
     <w:name w:val="CommentVarTok"/>
     <w:basedOn w:val="VerbatimChar"/>
     <w:rPr>
+      <w:rFonts w:ascii="Consolas" w:hAnsi="Consolas"/>
       <w:b/>
       <w:i/>
-      <w:color w:val="60a0b0"/>
+      <w:color w:val="60A0B0"/>
+      <w:sz w:val="22"/>
     </w:rPr>
   </w:style>
   <w:style w:type="character" w:customStyle="1" w:styleId="OtherTok">
     <w:name w:val="OtherTok"/>
     <w:basedOn w:val="VerbatimChar"/>
     <w:rPr>
+      <w:rFonts w:ascii="Consolas" w:hAnsi="Consolas"/>
       <w:color w:val="007020"/>
+      <w:sz w:val="22"/>
     </w:rPr>
   </w:style>
   <w:style w:type="character" w:customStyle="1" w:styleId="FunctionTok">
     <w:name w:val="FunctionTok"/>
     <w:basedOn w:val="VerbatimChar"/>
     <w:rPr>
-      <w:color w:val="06287e"/>
+      <w:rFonts w:ascii="Consolas" w:hAnsi="Consolas"/>
+      <w:color w:val="06287E"/>
+      <w:sz w:val="22"/>
     </w:rPr>
   </w:style>
   <w:style w:type="character" w:customStyle="1" w:styleId="VariableTok">
     <w:name w:val="VariableTok"/>
     <w:basedOn w:val="VerbatimChar"/>
     <w:rPr>
-      <w:color w:val="19177c"/>
+      <w:rFonts w:ascii="Consolas" w:hAnsi="Consolas"/>
+      <w:color w:val="19177C"/>
+      <w:sz w:val="22"/>
     </w:rPr>
   </w:style>
   <w:style w:type="character" w:customStyle="1" w:styleId="ControlFlowTok">
     <w:name w:val="ControlFlowTok"/>
     <w:basedOn w:val="VerbatimChar"/>
     <w:rPr>
+      <w:rFonts w:ascii="Consolas" w:hAnsi="Consolas"/>
       <w:b/>
       <w:color w:val="007020"/>
+      <w:sz w:val="22"/>
     </w:rPr>
   </w:style>
   <w:style w:type="character" w:customStyle="1" w:styleId="OperatorTok">
     <w:name w:val="OperatorTok"/>
     <w:basedOn w:val="VerbatimChar"/>
     <w:rPr>
+      <w:rFonts w:ascii="Consolas" w:hAnsi="Consolas"/>
       <w:color w:val="666666"/>
+      <w:sz w:val="22"/>
     </w:rPr>
   </w:style>
   <w:style w:type="character" w:customStyle="1" w:styleId="BuiltInTok">
     <w:name w:val="BuiltInTok"/>
     <w:basedOn w:val="VerbatimChar"/>
     <w:rPr>
+      <w:rFonts w:ascii="Consolas" w:hAnsi="Consolas"/>
       <w:color w:val="008000"/>
+      <w:sz w:val="22"/>
     </w:rPr>
   </w:style>
   <w:style w:type="character" w:customStyle="1" w:styleId="ExtensionTok">
     <w:name w:val="ExtensionTok"/>
     <w:basedOn w:val="VerbatimChar"/>
-    <w:rPr/>
+    <w:rPr>
+      <w:rFonts w:ascii="Consolas" w:hAnsi="Consolas"/>
+      <w:sz w:val="22"/>
+    </w:rPr>
   </w:style>
   <w:style w:type="character" w:customStyle="1" w:styleId="PreprocessorTok">
     <w:name w:val="PreprocessorTok"/>
     <w:basedOn w:val="VerbatimChar"/>
     <w:rPr>
-      <w:color w:val="bc7a00"/>
+      <w:rFonts w:ascii="Consolas" w:hAnsi="Consolas"/>
+      <w:color w:val="BC7A00"/>
+      <w:sz w:val="22"/>
     </w:rPr>
   </w:style>
   <w:style w:type="character" w:customStyle="1" w:styleId="AttributeTok">
     <w:name w:val="AttributeTok"/>
     <w:basedOn w:val="VerbatimChar"/>
     <w:rPr>
-      <w:color w:val="7d9029"/>
+      <w:rFonts w:ascii="Consolas" w:hAnsi="Consolas"/>
+      <w:color w:val="7D9029"/>
+      <w:sz w:val="22"/>
     </w:rPr>
   </w:style>
   <w:style w:type="character" w:customStyle="1" w:styleId="RegionMarkerTok">
     <w:name w:val="RegionMarkerTok"/>
     <w:basedOn w:val="VerbatimChar"/>
-    <w:rPr/>
+    <w:rPr>
+      <w:rFonts w:ascii="Consolas" w:hAnsi="Consolas"/>
+      <w:sz w:val="22"/>
+    </w:rPr>
   </w:style>
   <w:style w:type="character" w:customStyle="1" w:styleId="InformationTok">
     <w:name w:val="InformationTok"/>
     <w:basedOn w:val="VerbatimChar"/>
     <w:rPr>
+      <w:rFonts w:ascii="Consolas" w:hAnsi="Consolas"/>
       <w:b/>
       <w:i/>
-      <w:color w:val="60a0b0"/>
+      <w:color w:val="60A0B0"/>
+      <w:sz w:val="22"/>
     </w:rPr>
   </w:style>
   <w:style w:type="character" w:customStyle="1" w:styleId="WarningTok">
     <w:name w:val="WarningTok"/>
     <w:basedOn w:val="VerbatimChar"/>
     <w:rPr>
+      <w:rFonts w:ascii="Consolas" w:hAnsi="Consolas"/>
       <w:b/>
       <w:i/>
-      <w:color w:val="60a0b0"/>
+      <w:color w:val="60A0B0"/>
+      <w:sz w:val="22"/>
     </w:rPr>
   </w:style>
   <w:style w:type="character" w:customStyle="1" w:styleId="AlertTok">
     <w:name w:val="AlertTok"/>
     <w:basedOn w:val="VerbatimChar"/>
     <w:rPr>
+      <w:rFonts w:ascii="Consolas" w:hAnsi="Consolas"/>
       <w:b/>
-      <w:color w:val="ff0000"/>
+      <w:color w:val="FF0000"/>
+      <w:sz w:val="22"/>
     </w:rPr>
   </w:style>
   <w:style w:type="character" w:customStyle="1" w:styleId="ErrorTok">
     <w:name w:val="ErrorTok"/>
     <w:basedOn w:val="VerbatimChar"/>
     <w:rPr>
+      <w:rFonts w:ascii="Consolas" w:hAnsi="Consolas"/>
       <w:b/>
-      <w:color w:val="ff0000"/>
+      <w:color w:val="FF0000"/>
+      <w:sz w:val="22"/>
     </w:rPr>
   </w:style>
   <w:style w:type="character" w:customStyle="1" w:styleId="NormalTok">
     <w:name w:val="NormalTok"/>
     <w:basedOn w:val="VerbatimChar"/>
-    <w:rPr/>
+    <w:rPr>
+      <w:rFonts w:ascii="Consolas" w:hAnsi="Consolas"/>
+      <w:sz w:val="22"/>
+    </w:rPr>
   </w:style>
 </w:styles>
 </file>

</xml_diff>